<commit_message>
Critical review built in: fixed placebo pools, clean comparison cells, WCR wild bootstrap, MINEM gold correction, unified palette, team plan v2
- Placebo-in-space: Tambopata no longer in its own placebo pool (peru_models, peru.py)
- Cell panel: contaminated reference cells dropped, pooled 2014-18 reference, 2010-13 lead test, WCR wild cluster bootstrap (999 draws)
- Twins: Munduruku dropped (2021 operation); Kayapo coded 2024-09; Brazil staggered DiD + RI
- MINEM gold files parsed: official series = declared + artisanal estimate until 2019 (checked vs BCRP 2012, 2019)
- AMW vs MapBiomas densification check (review.md), risk-map spatial hold-out, time-consistent legality
- One palette across all figures; brief figure redesigned; team plan with treatment/borders/comparison groups and sub-teams

Co-Authored-By: Claude Opus 5.5 <noreply@anthropic.com>
</commit_message>
<xml_diff>
--- a/docs/team_plan/TEAM_PLAN_GroupAnteater_Q2.docx
+++ b/docs/team_plan/TEAM_PLAN_GroupAnteater_Q2.docx
@@ -125,7 +125,7 @@
         <w:t xml:space="preserve">Group and members: </w:t>
       </w:r>
       <w:r>
-        <w:t>Group Giant Anteater. Ruby Ann Grambauer, Sebastian Schmid, [add members].</w:t>
+        <w:t>Group Giant Anteater. Ruby Ann Grambauer, Sebastian Schmid, Member 3, Member 4, Member 5 (replace placeholders).</w:t>
       </w:r>
     </w:p>
     <w:p>
@@ -139,7 +139,7 @@
         <w:t xml:space="preserve">Question: </w:t>
       </w:r>
       <w:r>
-        <w:t>Question 2, Peru (Operation Mercurio, from February 2019). Brazil (Yanomami operation, February 2023) as a short second case.</w:t>
+        <w:t>Question 2, Peru (Operation Mercurio, from 19 Feb 2019). Brazil (Yanomami, Feb 2023) as an appendix case.</w:t>
       </w:r>
     </w:p>
     <w:p>
@@ -153,7 +153,7 @@
         <w:t xml:space="preserve">1. Our question. </w:t>
       </w:r>
       <w:r>
-        <w:t>When Operation Mercurio hit La Pampa (Tambopata buffer zone), did illegal gold mining stop there, for how long, and did it cross the Interoceanic Highway into the legal mining corridor?</w:t>
+        <w:t>Did Operation Mercurio reduce new mining in La Pampa during (2019-21) and after (2022-25) the operation, and did mining move across the Interoceanic Highway into the legal mining corridor?</w:t>
       </w:r>
     </w:p>
     <w:p>
@@ -167,7 +167,7 @@
         <w:t xml:space="preserve">2. Unit and years. </w:t>
       </w:r>
       <w:r>
-        <w:t>One row is one zone in one year, Madre de Dios, 2010-2025: La Pampa sector, rest of the Tambopata buffer zone, the legal corridor across the road, rest of the corridor, native communities, other buffer zones, Tambopata reserve. Outcome: land mapped as mining for the first time, and returns to old pits (ha).</w:t>
+        <w:t>Main panel: 1-km cell x year, Madre de Dios study window (14,241 cells), 2010-2025. Zone-level panel: 15 Peruvian buffer zones x year, 2011-2025. Outcome: land mapped as mining for the first time (ha), MapBiomas Peru Collection 4 rasters; secondary: returns to old pits; net addition (course measure).</w:t>
       </w:r>
     </w:p>
     <w:p>
@@ -181,7 +181,7 @@
         <w:t xml:space="preserve">3. Comparison. </w:t>
       </w:r>
       <w:r>
-        <w:t>We compare the Tambopata buffer zone (and its La Pampa sector) to 14 other Peruvian buffer zones with mining before 2019, before (2016-18), during (2019-21) and after (2022-25) Mercurio; plus a rule-based twin abroad (Amana National Forest, Brazil). For displacement we compare the south and north sides of the highway. We chose these groups because they mined before 2019 and share national shocks (gold price, COVID); nearby zones may have received miners, so we also use distant ones.</w:t>
+        <w:t>Treatment: La Pampa sector = Tambopata buffer zone (SERNANP) between 70.15 and 69.80 W; post = 2019-21, after = 2022-25. Border robustness: narrow (70.10-69.85 W), wide (70.20-69.75 W), whole buffer zone. Comparison groups: (i) 14 Peruvian buffer zones with mining before 2019; (ii) cells outside the named zones; (iii) two rule-based twins abroad (mining before 2019, no operation 2017-21, lowland, similar size); (iv) Amarakaeri buffer zone as 'less treated' (Mercurio II from Dec 2019). Models: y_zt = a_z + g_t + b D_zt + e (zone and year fixed effects); event study with year leads/lags, 2014-18 pooled reference; cell DiD y_ct = a_c + g_t + sum b_zp + gold-bearing x year effects, comparison cells outside the corridor, errors clustered by 10-km block plus wild cluster bootstrap; randomization inference over fake places and fake start dates (one treated zone). Displacement: corridor within 10 km north of the highway; 1-km road bands -30..+30 km; mean depth (trend break, Newey-West).</w:t>
       </w:r>
     </w:p>
     <w:p>
@@ -195,7 +195,7 @@
         <w:t xml:space="preserve">4. Sources. </w:t>
       </w:r>
       <w:r>
-        <w:t>From the data pack: peru_bufferzone_year, peru_department_year, prices. Added: MapBiomas Peru Collection 4 rasters and protected-area statistics (peru.mapbiomas.org); SERNANP boundaries; INGEMMET mining corridor and geology (GEOCATMIN); RAISG roads; UMD GLAD forest-loss alerts; Amazon Mining Watch; MAAP reports #130, #193, #208, #241.</w:t>
+        <w:t>Pack: peru_bufferzone_year, peru_department_year, prices. Added: MapBiomas Peru Col 4 rasters; SERNANP boundaries; INGEMMET corridor, geology and cadastre; RAISG roads; MapBiomas Amazonia communities; UMD GLAD alerts; Amazon Mining Watch (incl. MAAP #235 legality layer); MINEM gold production; MEF PP 0128 spending; MapBiomas Brazil Col 11 rasters.</w:t>
       </w:r>
     </w:p>
     <w:p>
@@ -209,7 +209,7 @@
         <w:t xml:space="preserve">5. Initial statistics. </w:t>
       </w:r>
       <w:r>
-        <w:t>Our raster count shows 20,716 ha of mining in the Tambopata buffer zone in 2025; the publisher's table shows 20,730 ha. Tambopata National Reserve: 776 ha vs 777 ha on the MapBiomas platform.</w:t>
+        <w:t>Our raster count: Tambopata buffer zone 2025 = 20,716 ha; publisher table 20,730 ha. Reserve: 776 vs 777 ha (platform). Brazil Col 11 raster: Kayapo 2024 = 17,628 vs 17,632 ha (platform).</w:t>
       </w:r>
     </w:p>
     <w:p>
@@ -223,7 +223,7 @@
         <w:t xml:space="preserve">6. Main concern. </w:t>
       </w:r>
       <w:r>
-        <w:t>There is one targeted zone, and other events overlap (COVID 2020, Plan Restauracion 2021, the 2023 emergency, the gold price). Satellites miss river dredges and mercury; net numbers hide miners returning to old pits; clearing in La Pampa continued through 2019. Nearby zones may have received miners or had their own enforcement.</w:t>
+        <w:t>One treated zone and overlapping events (COVID 2020, Plan Restauracion 2021, emergency 2023); the comparison cells include the corridor that received miners; pre-trends at cell level fail for La Pampa; satellites miss dredges and mercury; the official gold series changed definition in 2015 and 2020.</w:t>
       </w:r>
     </w:p>
     <w:p>
@@ -234,10 +234,10 @@
         <w:rPr>
           <w:b/>
         </w:rPr>
-        <w:t xml:space="preserve">7. Who does what (to confirm). </w:t>
-      </w:r>
-      <w:r>
-        <w:t>Data and data log: Sebastian. Analysis: Sebastian, reviewed by Ruby. Figure: [add]. Brief and slides: Ruby, [add]. Replication files: Sebastian.</w:t>
+        <w:t xml:space="preserve">7. Who does what. </w:t>
+      </w:r>
+      <w:r>
+        <w:t>Team A, description (Ruby, Member 3): zones, displacement layers, old pits, timing, legality, qualitative background. Team B, causal attempts (Sebastian, Member 4): DiD and event studies, cell panel, twins, synthetic control, Brazil. Team C, brief, slides and replication (Member 5, with Ruby): figure, references, data log, replication zip. All: review of each other's section before Lesson 5.</w:t>
       </w:r>
     </w:p>
     <w:sectPr/>

</xml_diff>

<commit_message>
Team plan: edits from Word
Co-Authored-By: Claude Opus 5.5 <noreply@anthropic.com>
</commit_message>
<xml_diff>
--- a/docs/team_plan/TEAM_PLAN_GroupAnteater_Q2.docx
+++ b/docs/team_plan/TEAM_PLAN_GroupAnteater_Q2.docx
@@ -1,55 +1,13 @@
 
 <file path=word/document.xml><?xml version="1.0" encoding="utf-8"?>
-<w:document xmlns:w="http://schemas.openxmlformats.org/wordprocessingml/2006/main" xmlns:m="http://schemas.openxmlformats.org/officeDocument/2006/math" xmlns:r="http://schemas.openxmlformats.org/officeDocument/2006/relationships" xmlns:o="urn:schemas-microsoft-com:office:office" xmlns:v="urn:schemas-microsoft-com:vml" xmlns:w10="urn:schemas-microsoft-com:office:word" xmlns:a="http://schemas.openxmlformats.org/drawingml/2006/main" xmlns:pic="http://schemas.openxmlformats.org/drawingml/2006/picture" xmlns:wp="http://schemas.openxmlformats.org/drawingml/2006/wordprocessingDrawing">
+<w:document xmlns:wpc="http://schemas.microsoft.com/office/word/2010/wordprocessingCanvas" xmlns:cx="http://schemas.microsoft.com/office/drawing/2014/chartex" xmlns:cx1="http://schemas.microsoft.com/office/drawing/2015/9/8/chartex" xmlns:cx2="http://schemas.microsoft.com/office/drawing/2015/10/21/chartex" xmlns:cx3="http://schemas.microsoft.com/office/drawing/2016/5/9/chartex" xmlns:cx4="http://schemas.microsoft.com/office/drawing/2016/5/10/chartex" xmlns:cx5="http://schemas.microsoft.com/office/drawing/2016/5/11/chartex" xmlns:cx6="http://schemas.microsoft.com/office/drawing/2016/5/12/chartex" xmlns:cx7="http://schemas.microsoft.com/office/drawing/2016/5/13/chartex" xmlns:cx8="http://schemas.microsoft.com/office/drawing/2016/5/14/chartex" xmlns:mc="http://schemas.openxmlformats.org/markup-compatibility/2006" xmlns:m="http://schemas.openxmlformats.org/officeDocument/2006/math" xmlns:aink="http://schemas.microsoft.com/office/drawing/2016/ink" xmlns:am3d="http://schemas.microsoft.com/office/drawing/2017/model3d" xmlns:oel="http://schemas.microsoft.com/office/2019/extlst" xmlns:r="http://schemas.openxmlformats.org/officeDocument/2006/relationships" xmlns:wp14="http://schemas.microsoft.com/office/word/2010/wordprocessingDrawing" xmlns:wp="http://schemas.openxmlformats.org/drawingml/2006/wordprocessingDrawing" xmlns:wpg="http://schemas.microsoft.com/office/word/2010/wordprocessingGroup" xmlns:wpi="http://schemas.microsoft.com/office/word/2010/wordprocessingInk" xmlns:wps="http://schemas.microsoft.com/office/word/2010/wordprocessingShape" xmlns:o="urn:schemas-microsoft-com:office:office" xmlns:v="urn:schemas-microsoft-com:vml" xmlns:w10="urn:schemas-microsoft-com:office:word" xmlns:w="http://schemas.openxmlformats.org/wordprocessingml/2006/main" xmlns:w14="http://schemas.microsoft.com/office/word/2010/wordml" xmlns:w15="http://schemas.microsoft.com/office/word/2012/wordml" xmlns:w16cex="http://schemas.microsoft.com/office/word/2018/wordml/cex" xmlns:w16cid="http://schemas.microsoft.com/office/word/2016/wordml/cid" xmlns:w16="http://schemas.microsoft.com/office/word/2018/wordml" xmlns:w16sdtdh="http://schemas.microsoft.com/office/word/2020/wordml/sdtdatahash" xmlns:w16sdtfl="http://schemas.microsoft.com/office/word/2024/wordml/sdtformatlock" xmlns:w16se="http://schemas.microsoft.com/office/word/2015/wordml/symex" xmlns:w16du="http://schemas.microsoft.com/office/word/2023/wordml/word16du" xmlns:wne="http://schemas.microsoft.com/office/word/2006/wordml" mc:Ignorable="w14 w15 w16se w16cid w16 w16cex w16sdtdh w16sdtfl w16du wp14">
   <w:body>
     <w:p>
       <w:pPr>
         <w:pStyle w:val="Title"/>
       </w:pPr>
       <w:r>
-        <w:t xml:space="preserve">Team</w:t>
-      </w:r>
-      <w:r>
-        <w:t xml:space="preserve"> </w:t>
-      </w:r>
-      <w:r>
-        <w:t xml:space="preserve">plan:</w:t>
-      </w:r>
-      <w:r>
-        <w:t xml:space="preserve"> </w:t>
-      </w:r>
-      <w:r>
-        <w:t xml:space="preserve">illegal</w:t>
-      </w:r>
-      <w:r>
-        <w:t xml:space="preserve"> </w:t>
-      </w:r>
-      <w:r>
-        <w:t xml:space="preserve">gold</w:t>
-      </w:r>
-      <w:r>
-        <w:t xml:space="preserve"> </w:t>
-      </w:r>
-      <w:r>
-        <w:t xml:space="preserve">mining</w:t>
-      </w:r>
-      <w:r>
-        <w:t xml:space="preserve"> </w:t>
-      </w:r>
-      <w:r>
-        <w:t xml:space="preserve">in</w:t>
-      </w:r>
-      <w:r>
-        <w:t xml:space="preserve"> </w:t>
-      </w:r>
-      <w:r>
-        <w:t xml:space="preserve">the</w:t>
-      </w:r>
-      <w:r>
-        <w:t xml:space="preserve"> </w:t>
-      </w:r>
-      <w:r>
-        <w:t xml:space="preserve">Amazon</w:t>
+        <w:t>Team plan: illegal gold mining in the Amazon</w:t>
       </w:r>
     </w:p>
     <w:p>
@@ -57,66 +15,15 @@
         <w:pStyle w:val="Subtitle"/>
       </w:pPr>
       <w:r>
-        <w:t xml:space="preserve">Half</w:t>
-      </w:r>
-      <w:r>
-        <w:t xml:space="preserve"> </w:t>
-      </w:r>
-      <w:r>
-        <w:t xml:space="preserve">a</w:t>
-      </w:r>
-      <w:r>
-        <w:t xml:space="preserve"> </w:t>
-      </w:r>
-      <w:r>
-        <w:t xml:space="preserve">page.</w:t>
-      </w:r>
-      <w:r>
-        <w:t xml:space="preserve"> </w:t>
-      </w:r>
-      <w:r>
-        <w:t xml:space="preserve">Submit</w:t>
-      </w:r>
-      <w:r>
-        <w:t xml:space="preserve"> </w:t>
-      </w:r>
-      <w:r>
-        <w:t xml:space="preserve">by</w:t>
-      </w:r>
-      <w:r>
-        <w:t xml:space="preserve"> </w:t>
-      </w:r>
-      <w:r>
-        <w:t xml:space="preserve">the</w:t>
-      </w:r>
-      <w:r>
-        <w:t xml:space="preserve"> </w:t>
-      </w:r>
-      <w:r>
-        <w:t xml:space="preserve">end</w:t>
-      </w:r>
-      <w:r>
-        <w:t xml:space="preserve"> </w:t>
-      </w:r>
-      <w:r>
-        <w:t xml:space="preserve">of</w:t>
-      </w:r>
-      <w:r>
-        <w:t xml:space="preserve"> </w:t>
-      </w:r>
-      <w:r>
-        <w:t xml:space="preserve">the</w:t>
-      </w:r>
-      <w:r>
-        <w:t xml:space="preserve"> </w:t>
-      </w:r>
-      <w:r>
-        <w:t xml:space="preserve">day.</w:t>
+        <w:t>Half a page. Submit by the end of the day.</w:t>
       </w:r>
     </w:p>
     <w:p>
       <w:pPr>
         <w:pStyle w:val="FirstParagraph"/>
+        <w:rPr>
+          <w:lang w:val="de-DE"/>
+        </w:rPr>
       </w:pPr>
       <w:r>
         <w:rPr>
@@ -125,7 +32,61 @@
         <w:t xml:space="preserve">Group and members: </w:t>
       </w:r>
       <w:r>
-        <w:t>Group Giant Anteater. Ruby Ann Grambauer, Sebastian Schmid, Member 3, Member 4, Member 5 (replace placeholders).</w:t>
+        <w:t xml:space="preserve">Group Giant Anteater. </w:t>
+      </w:r>
+      <w:r>
+        <w:rPr>
+          <w:lang w:val="de-DE"/>
+        </w:rPr>
+        <w:t xml:space="preserve">Ruby Ann Grambauer, Sebastian Schmid, </w:t>
+      </w:r>
+      <w:r>
+        <w:rPr>
+          <w:lang w:val="de-DE"/>
+        </w:rPr>
+        <w:t>Laurens van der Lely</w:t>
+      </w:r>
+      <w:r>
+        <w:rPr>
+          <w:lang w:val="de-DE"/>
+        </w:rPr>
+        <w:t xml:space="preserve">, </w:t>
+      </w:r>
+      <w:r>
+        <w:rPr>
+          <w:lang w:val="de-DE"/>
+        </w:rPr>
+        <w:t>Omkar Mate</w:t>
+      </w:r>
+      <w:r>
+        <w:rPr>
+          <w:lang w:val="de-DE"/>
+        </w:rPr>
+        <w:t>,</w:t>
+      </w:r>
+      <w:r>
+        <w:rPr>
+          <w:lang w:val="de-DE"/>
+        </w:rPr>
+        <w:t xml:space="preserve"> </w:t>
+      </w:r>
+      <w:r>
+        <w:rPr>
+          <w:lang w:val="de-DE"/>
+        </w:rPr>
+        <w:t>D</w:t>
+      </w:r>
+      <w:r>
+        <w:rPr>
+          <w:lang w:val="de-DE"/>
+        </w:rPr>
+        <w:t>hruv Chaudhari</w:t>
+      </w:r>
+      <w:r>
+        <w:rPr>
+          <w:lang w:val="de-DE"/>
+        </w:rPr>
+        <w:t>.</w:t>
       </w:r>
     </w:p>
     <w:p>
@@ -153,7 +114,19 @@
         <w:t xml:space="preserve">1. Our question. </w:t>
       </w:r>
       <w:r>
-        <w:t>Did Operation Mercurio reduce new mining in La Pampa during (2019-21) and after (2022-25) the operation, and did mining move across the Interoceanic Highway into the legal mining corridor?</w:t>
+        <w:t xml:space="preserve">Did Operation Mercurio reduce new mining in La Pampa during (2019-21) and after (2022-25) the operation, and did mining move </w:t>
+      </w:r>
+      <w:r>
+        <w:t>(</w:t>
+      </w:r>
+      <w:r>
+        <w:t>across the Interoceanic Highway into the legal mining corridor</w:t>
+      </w:r>
+      <w:r>
+        <w:t>)</w:t>
+      </w:r>
+      <w:r>
+        <w:t>?</w:t>
       </w:r>
     </w:p>
     <w:p>
@@ -181,7 +154,13 @@
         <w:t xml:space="preserve">3. Comparison. </w:t>
       </w:r>
       <w:r>
-        <w:t>Treatment: La Pampa sector = Tambopata buffer zone (SERNANP) between 70.15 and 69.80 W; post = 2019-21, after = 2022-25. Border robustness: narrow (70.10-69.85 W), wide (70.20-69.75 W), whole buffer zone. Comparison groups: (i) 14 Peruvian buffer zones with mining before 2019; (ii) cells outside the named zones; (iii) two rule-based twins abroad (mining before 2019, no operation 2017-21, lowland, similar size); (iv) Amarakaeri buffer zone as 'less treated' (Mercurio II from Dec 2019). Models: y_zt = a_z + g_t + b D_zt + e (zone and year fixed effects); event study with year leads/lags, 2014-18 pooled reference; cell DiD y_ct = a_c + g_t + sum b_zp + gold-bearing x year effects, comparison cells outside the corridor, errors clustered by 10-km block plus wild cluster bootstrap; randomization inference over fake places and fake start dates (one treated zone). Displacement: corridor within 10 km north of the highway; 1-km road bands -30..+30 km; mean depth (trend break, Newey-West).</w:t>
+        <w:t>Treatment: La Pampa sector = Tambopata buffer zone (SERNANP) between 70.15 and 69.80 W; post = 2019-21, after = 2022-25. Border robustness: narrow (70.10-69.85 W), wide (70.20-69.75 W), whole buffer zone. Comparison groups: (i) 14 Peruvian buffer zones with mining before 2019; (ii) cells outside the named zones; (iii) two rule-based twins abroad (mining before 2019, no operation 2017-21, lowland, similar size); (iv) Amarakaeri buffer zone as 'less treated' (Mercurio II from Dec 2019). Models: y_zt = a_z + g_t + b D_zt + e (zone and year fixed effects); event study with year leads/lags, 2014-18 pooled reference; cell DiD y_ct = a_c + g_t + sum b_zp + gold-bearing x year effects, comparison cells outside the corridor, errors clustered by 10-km block plus wild cluster bootstrap; randomization inference over fake places and fake start dates (one treated zone). Displacement: corridor within 10 km north of the highway; 1-km road bands -30</w:t>
+      </w:r>
+      <w:r>
+        <w:t xml:space="preserve">/ </w:t>
+      </w:r>
+      <w:r>
+        <w:t>+30 km; mean depth (trend break, Newey-West).</w:t>
       </w:r>
     </w:p>
     <w:p>
@@ -234,34 +213,86 @@
         <w:rPr>
           <w:b/>
         </w:rPr>
+        <w:lastRenderedPageBreak/>
         <w:t xml:space="preserve">7. Who does what. </w:t>
       </w:r>
       <w:r>
-        <w:t>Team A, description (Ruby, Member 3): zones, displacement layers, old pits, timing, legality, qualitative background. Team B, causal attempts (Sebastian, Member 4): DiD and event studies, cell panel, twins, synthetic control, Brazil. Team C, brief, slides and replication (Member 5, with Ruby): figure, references, data log, replication zip. All: review of each other's section before Lesson 5.</w:t>
+        <w:t xml:space="preserve">Team A, description (Ruby, </w:t>
+      </w:r>
+      <w:r>
+        <w:t>Laurens</w:t>
+      </w:r>
+      <w:r>
+        <w:t xml:space="preserve">): zones, displacement layers, old pits, timing, legality, qualitative background. Team B, causal attempts (Sebastian, </w:t>
+      </w:r>
+      <w:r>
+        <w:t>Dhruv</w:t>
+      </w:r>
+      <w:r>
+        <w:t xml:space="preserve">): </w:t>
+      </w:r>
+      <w:proofErr w:type="spellStart"/>
+      <w:r>
+        <w:t>DiD</w:t>
+      </w:r>
+      <w:proofErr w:type="spellEnd"/>
+      <w:r>
+        <w:t xml:space="preserve"> and event studies, cell panel, twins, synthetic control, Brazil. Team C, brief, slides and replication (</w:t>
+      </w:r>
+      <w:r>
+        <w:t>Omkar</w:t>
+      </w:r>
+      <w:r>
+        <w:t>, with Ruby): figure, references, data log, replication zip. All: review of each other's section before Lesson 5.</w:t>
       </w:r>
     </w:p>
-    <w:sectPr/>
+    <w:sectPr>
+      <w:pgSz w:w="12240" w:h="15840"/>
+      <w:pgMar w:top="1440" w:right="1440" w:bottom="1440" w:left="1440" w:header="720" w:footer="720" w:gutter="0"/>
+      <w:cols w:space="720"/>
+    </w:sectPr>
   </w:body>
 </w:document>
 </file>
 
-<file path=word/comments.xml><?xml version="1.0" encoding="utf-8"?>
-<w:comments xmlns:w="http://schemas.openxmlformats.org/wordprocessingml/2006/main" xmlns:m="http://schemas.openxmlformats.org/officeDocument/2006/math" xmlns:r="http://schemas.openxmlformats.org/officeDocument/2006/relationships" xmlns:o="urn:schemas-microsoft-com:office:office" xmlns:v="urn:schemas-microsoft-com:vml" xmlns:w10="urn:schemas-microsoft-com:office:word" xmlns:a="http://schemas.openxmlformats.org/drawingml/2006/main" xmlns:pic="http://schemas.openxmlformats.org/drawingml/2006/picture" xmlns:wp="http://schemas.openxmlformats.org/drawingml/2006/wordprocessingDrawing"/>
+<file path=word/endnotes.xml><?xml version="1.0" encoding="utf-8"?>
+<w:endnotes xmlns:wpc="http://schemas.microsoft.com/office/word/2010/wordprocessingCanvas" xmlns:cx="http://schemas.microsoft.com/office/drawing/2014/chartex" xmlns:cx1="http://schemas.microsoft.com/office/drawing/2015/9/8/chartex" xmlns:cx2="http://schemas.microsoft.com/office/drawing/2015/10/21/chartex" xmlns:cx3="http://schemas.microsoft.com/office/drawing/2016/5/9/chartex" xmlns:cx4="http://schemas.microsoft.com/office/drawing/2016/5/10/chartex" xmlns:cx5="http://schemas.microsoft.com/office/drawing/2016/5/11/chartex" xmlns:cx6="http://schemas.microsoft.com/office/drawing/2016/5/12/chartex" xmlns:cx7="http://schemas.microsoft.com/office/drawing/2016/5/13/chartex" xmlns:cx8="http://schemas.microsoft.com/office/drawing/2016/5/14/chartex" xmlns:mc="http://schemas.openxmlformats.org/markup-compatibility/2006" xmlns:m="http://schemas.openxmlformats.org/officeDocument/2006/math" xmlns:aink="http://schemas.microsoft.com/office/drawing/2016/ink" xmlns:am3d="http://schemas.microsoft.com/office/drawing/2017/model3d" xmlns:oel="http://schemas.microsoft.com/office/2019/extlst" xmlns:r="http://schemas.openxmlformats.org/officeDocument/2006/relationships" xmlns:wp14="http://schemas.microsoft.com/office/word/2010/wordprocessingDrawing" xmlns:wp="http://schemas.openxmlformats.org/drawingml/2006/wordprocessingDrawing" xmlns:wpg="http://schemas.microsoft.com/office/word/2010/wordprocessingGroup" xmlns:wpi="http://schemas.microsoft.com/office/word/2010/wordprocessingInk" xmlns:wps="http://schemas.microsoft.com/office/word/2010/wordprocessingShape" xmlns:o="urn:schemas-microsoft-com:office:office" xmlns:v="urn:schemas-microsoft-com:vml" xmlns:w10="urn:schemas-microsoft-com:office:word" xmlns:w="http://schemas.openxmlformats.org/wordprocessingml/2006/main" xmlns:w14="http://schemas.microsoft.com/office/word/2010/wordml" xmlns:w15="http://schemas.microsoft.com/office/word/2012/wordml" xmlns:w16cex="http://schemas.microsoft.com/office/word/2018/wordml/cex" xmlns:w16cid="http://schemas.microsoft.com/office/word/2016/wordml/cid" xmlns:w16="http://schemas.microsoft.com/office/word/2018/wordml" xmlns:w16sdtdh="http://schemas.microsoft.com/office/word/2020/wordml/sdtdatahash" xmlns:w16sdtfl="http://schemas.microsoft.com/office/word/2024/wordml/sdtformatlock" xmlns:w16se="http://schemas.microsoft.com/office/word/2015/wordml/symex" xmlns:w16du="http://schemas.microsoft.com/office/word/2023/wordml/word16du" xmlns:wne="http://schemas.microsoft.com/office/word/2006/wordml" mc:Ignorable="w14 w15 w16se w16cid w16 w16cex w16sdtdh w16sdtfl w16du wp14">
+  <w:endnote w:type="separator" w:id="-1">
+    <w:p>
+      <w:pPr>
+        <w:spacing w:after="0"/>
+      </w:pPr>
+      <w:r>
+        <w:separator/>
+      </w:r>
+    </w:p>
+  </w:endnote>
+  <w:endnote w:type="continuationSeparator" w:id="0">
+    <w:p>
+      <w:pPr>
+        <w:spacing w:after="0"/>
+      </w:pPr>
+      <w:r>
+        <w:continuationSeparator/>
+      </w:r>
+    </w:p>
+  </w:endnote>
+</w:endnotes>
 </file>
 
 <file path=word/footnotes.xml><?xml version="1.0" encoding="utf-8"?>
-<w:footnotes xmlns:w="http://schemas.openxmlformats.org/wordprocessingml/2006/main" xmlns:m="http://schemas.openxmlformats.org/officeDocument/2006/math" xmlns:r="http://schemas.openxmlformats.org/officeDocument/2006/relationships" xmlns:o="urn:schemas-microsoft-com:office:office" xmlns:v="urn:schemas-microsoft-com:vml" xmlns:w10="urn:schemas-microsoft-com:office:word" xmlns:a="http://schemas.openxmlformats.org/drawingml/2006/main" xmlns:pic="http://schemas.openxmlformats.org/drawingml/2006/picture" xmlns:wp="http://schemas.openxmlformats.org/drawingml/2006/wordprocessingDrawing">
+<w:footnotes xmlns:wpc="http://schemas.microsoft.com/office/word/2010/wordprocessingCanvas" xmlns:cx="http://schemas.microsoft.com/office/drawing/2014/chartex" xmlns:cx1="http://schemas.microsoft.com/office/drawing/2015/9/8/chartex" xmlns:cx2="http://schemas.microsoft.com/office/drawing/2015/10/21/chartex" xmlns:cx3="http://schemas.microsoft.com/office/drawing/2016/5/9/chartex" xmlns:cx4="http://schemas.microsoft.com/office/drawing/2016/5/10/chartex" xmlns:cx5="http://schemas.microsoft.com/office/drawing/2016/5/11/chartex" xmlns:cx6="http://schemas.microsoft.com/office/drawing/2016/5/12/chartex" xmlns:cx7="http://schemas.microsoft.com/office/drawing/2016/5/13/chartex" xmlns:cx8="http://schemas.microsoft.com/office/drawing/2016/5/14/chartex" xmlns:mc="http://schemas.openxmlformats.org/markup-compatibility/2006" xmlns:m="http://schemas.openxmlformats.org/officeDocument/2006/math" xmlns:aink="http://schemas.microsoft.com/office/drawing/2016/ink" xmlns:am3d="http://schemas.microsoft.com/office/drawing/2017/model3d" xmlns:oel="http://schemas.microsoft.com/office/2019/extlst" xmlns:r="http://schemas.openxmlformats.org/officeDocument/2006/relationships" xmlns:wp14="http://schemas.microsoft.com/office/word/2010/wordprocessingDrawing" xmlns:wp="http://schemas.openxmlformats.org/drawingml/2006/wordprocessingDrawing" xmlns:wpg="http://schemas.microsoft.com/office/word/2010/wordprocessingGroup" xmlns:wpi="http://schemas.microsoft.com/office/word/2010/wordprocessingInk" xmlns:wps="http://schemas.microsoft.com/office/word/2010/wordprocessingShape" xmlns:o="urn:schemas-microsoft-com:office:office" xmlns:v="urn:schemas-microsoft-com:vml" xmlns:w10="urn:schemas-microsoft-com:office:word" xmlns:w="http://schemas.openxmlformats.org/wordprocessingml/2006/main" xmlns:w14="http://schemas.microsoft.com/office/word/2010/wordml" xmlns:w15="http://schemas.microsoft.com/office/word/2012/wordml" xmlns:w16cex="http://schemas.microsoft.com/office/word/2018/wordml/cex" xmlns:w16cid="http://schemas.microsoft.com/office/word/2016/wordml/cid" xmlns:w16="http://schemas.microsoft.com/office/word/2018/wordml" xmlns:w16sdtdh="http://schemas.microsoft.com/office/word/2020/wordml/sdtdatahash" xmlns:w16sdtfl="http://schemas.microsoft.com/office/word/2024/wordml/sdtformatlock" xmlns:w16se="http://schemas.microsoft.com/office/word/2015/wordml/symex" xmlns:w16du="http://schemas.microsoft.com/office/word/2023/wordml/word16du" xmlns:wne="http://schemas.microsoft.com/office/word/2006/wordml" mc:Ignorable="w14 w15 w16se w16cid w16 w16cex w16sdtdh w16sdtfl w16du wp14">
+  <w:footnote w:type="separator" w:id="-1">
+    <w:p>
+      <w:r>
+        <w:separator/>
+      </w:r>
+    </w:p>
+  </w:footnote>
   <w:footnote w:type="continuationSeparator" w:id="0">
     <w:p>
       <w:r>
         <w:continuationSeparator/>
-      </w:r>
-    </w:p>
-  </w:footnote>
-  <w:footnote w:type="separator" w:id="-1">
-    <w:p>
-      <w:r>
-        <w:separator/>
       </w:r>
     </w:p>
   </w:footnote>
@@ -269,10 +300,11 @@
 </file>
 
 <file path=word/numbering.xml><?xml version="1.0" encoding="utf-8"?>
-<w:numbering xmlns:w="http://schemas.openxmlformats.org/wordprocessingml/2006/main">
-  <w:abstractNum w:abstractNumId="990">
-    <w:nsid w:val="A990"/>
+<w:numbering xmlns:wpc="http://schemas.microsoft.com/office/word/2010/wordprocessingCanvas" xmlns:cx="http://schemas.microsoft.com/office/drawing/2014/chartex" xmlns:cx1="http://schemas.microsoft.com/office/drawing/2015/9/8/chartex" xmlns:cx2="http://schemas.microsoft.com/office/drawing/2015/10/21/chartex" xmlns:cx3="http://schemas.microsoft.com/office/drawing/2016/5/9/chartex" xmlns:cx4="http://schemas.microsoft.com/office/drawing/2016/5/10/chartex" xmlns:cx5="http://schemas.microsoft.com/office/drawing/2016/5/11/chartex" xmlns:cx6="http://schemas.microsoft.com/office/drawing/2016/5/12/chartex" xmlns:cx7="http://schemas.microsoft.com/office/drawing/2016/5/13/chartex" xmlns:cx8="http://schemas.microsoft.com/office/drawing/2016/5/14/chartex" xmlns:mc="http://schemas.openxmlformats.org/markup-compatibility/2006" xmlns:m="http://schemas.openxmlformats.org/officeDocument/2006/math" xmlns:aink="http://schemas.microsoft.com/office/drawing/2016/ink" xmlns:am3d="http://schemas.microsoft.com/office/drawing/2017/model3d" xmlns:oel="http://schemas.microsoft.com/office/2019/extlst" xmlns:r="http://schemas.openxmlformats.org/officeDocument/2006/relationships" xmlns:wp14="http://schemas.microsoft.com/office/word/2010/wordprocessingDrawing" xmlns:wp="http://schemas.openxmlformats.org/drawingml/2006/wordprocessingDrawing" xmlns:wpg="http://schemas.microsoft.com/office/word/2010/wordprocessingGroup" xmlns:wpi="http://schemas.microsoft.com/office/word/2010/wordprocessingInk" xmlns:wps="http://schemas.microsoft.com/office/word/2010/wordprocessingShape" xmlns:o="urn:schemas-microsoft-com:office:office" xmlns:v="urn:schemas-microsoft-com:vml" xmlns:w10="urn:schemas-microsoft-com:office:word" xmlns:w="http://schemas.openxmlformats.org/wordprocessingml/2006/main" xmlns:w14="http://schemas.microsoft.com/office/word/2010/wordml" xmlns:w15="http://schemas.microsoft.com/office/word/2012/wordml" xmlns:w16cex="http://schemas.microsoft.com/office/word/2018/wordml/cex" xmlns:w16cid="http://schemas.microsoft.com/office/word/2016/wordml/cid" xmlns:w16="http://schemas.microsoft.com/office/word/2018/wordml" xmlns:w16sdtdh="http://schemas.microsoft.com/office/word/2020/wordml/sdtdatahash" xmlns:w16sdtfl="http://schemas.microsoft.com/office/word/2024/wordml/sdtformatlock" xmlns:w16se="http://schemas.microsoft.com/office/word/2015/wordml/symex" xmlns:w16du="http://schemas.microsoft.com/office/word/2023/wordml/word16du" xmlns:wne="http://schemas.microsoft.com/office/word/2006/wordml" mc:Ignorable="w14 w15 w16se w16cid w16 w16cex w16sdtdh w16sdtfl w16du wp14">
+  <w:abstractNum w:abstractNumId="0" w15:restartNumberingAfterBreak="0">
+    <w:nsid w:val="0000A990"/>
     <w:multiLevelType w:val="multilevel"/>
+    <w:tmpl w:val="DA4AFADA"/>
     <w:lvl w:ilvl="0">
       <w:numFmt w:val="bullet"/>
       <w:lvlText w:val=" "/>
@@ -346,21 +378,21 @@
       </w:pPr>
     </w:lvl>
   </w:abstractNum>
-  <w:num w:numId="1000">
-    <w:abstractNumId w:val="990"/>
+  <w:num w:numId="1" w16cid:durableId="1656375097">
+    <w:abstractNumId w:val="0"/>
   </w:num>
 </w:numbering>
 </file>
 
 <file path=word/styles.xml><?xml version="1.0" encoding="utf-8"?>
-<w:styles xmlns:r="http://schemas.openxmlformats.org/officeDocument/2006/relationships" xmlns:w="http://schemas.openxmlformats.org/wordprocessingml/2006/main">
+<w:styles xmlns:mc="http://schemas.openxmlformats.org/markup-compatibility/2006" xmlns:r="http://schemas.openxmlformats.org/officeDocument/2006/relationships" xmlns:w="http://schemas.openxmlformats.org/wordprocessingml/2006/main" xmlns:w14="http://schemas.microsoft.com/office/word/2010/wordml" xmlns:w15="http://schemas.microsoft.com/office/word/2012/wordml" xmlns:w16cex="http://schemas.microsoft.com/office/word/2018/wordml/cex" xmlns:w16cid="http://schemas.microsoft.com/office/word/2016/wordml/cid" xmlns:w16="http://schemas.microsoft.com/office/word/2018/wordml" xmlns:w16sdtdh="http://schemas.microsoft.com/office/word/2020/wordml/sdtdatahash" xmlns:w16sdtfl="http://schemas.microsoft.com/office/word/2024/wordml/sdtformatlock" xmlns:w16se="http://schemas.microsoft.com/office/word/2015/wordml/symex" xmlns:w16du="http://schemas.microsoft.com/office/word/2023/wordml/word16du" mc:Ignorable="w14 w15 w16se w16cid w16 w16cex w16sdtdh w16sdtfl w16du">
   <w:docDefaults>
     <w:rPrDefault>
       <w:rPr>
-        <w:rFonts w:asciiTheme="minorHAnsi" w:cstheme="minorBidi" w:eastAsiaTheme="minorHAnsi" w:hAnsiTheme="minorHAnsi"/>
+        <w:rFonts w:asciiTheme="minorHAnsi" w:eastAsiaTheme="minorHAnsi" w:hAnsiTheme="minorHAnsi" w:cstheme="minorBidi"/>
         <w:sz w:val="24"/>
         <w:szCs w:val="24"/>
-        <w:lang w:bidi="ar-SA" w:eastAsia="en-US" w:val="en-US"/>
+        <w:lang w:val="en-US" w:eastAsia="en-US" w:bidi="ar-SA"/>
       </w:rPr>
     </w:rPrDefault>
     <w:pPrDefault>
@@ -369,35 +401,478 @@
       </w:pPr>
     </w:pPrDefault>
   </w:docDefaults>
-  <w:latentStyles w:count="276" w:defLockedState="0" w:defQFormat="0" w:defSemiHidden="0" w:defUIPriority="0" w:defUnhideWhenUsed="0"/>
-  <w:style w:default="1" w:styleId="Normal" w:type="paragraph">
+  <w:latentStyles w:defLockedState="0" w:defUIPriority="0" w:defSemiHidden="0" w:defUnhideWhenUsed="0" w:defQFormat="0" w:count="376">
+    <w:lsdException w:name="Normal Table" w:semiHidden="1" w:unhideWhenUsed="1"/>
+    <w:lsdException w:name="Table Simple 1" w:semiHidden="1" w:unhideWhenUsed="1"/>
+    <w:lsdException w:name="Table Simple 2" w:semiHidden="1" w:unhideWhenUsed="1"/>
+    <w:lsdException w:name="Table Simple 3" w:semiHidden="1" w:unhideWhenUsed="1"/>
+    <w:lsdException w:name="Table Classic 1" w:semiHidden="1" w:unhideWhenUsed="1"/>
+    <w:lsdException w:name="Table Classic 2" w:semiHidden="1" w:unhideWhenUsed="1"/>
+    <w:lsdException w:name="Table Classic 3" w:semiHidden="1" w:unhideWhenUsed="1"/>
+    <w:lsdException w:name="Table Classic 4" w:semiHidden="1" w:unhideWhenUsed="1"/>
+    <w:lsdException w:name="Table Colorful 1" w:semiHidden="1" w:unhideWhenUsed="1"/>
+    <w:lsdException w:name="Table Colorful 2" w:semiHidden="1" w:unhideWhenUsed="1"/>
+    <w:lsdException w:name="Table Colorful 3" w:semiHidden="1" w:unhideWhenUsed="1"/>
+    <w:lsdException w:name="Table Columns 1" w:semiHidden="1" w:unhideWhenUsed="1"/>
+    <w:lsdException w:name="Table Columns 2" w:semiHidden="1" w:unhideWhenUsed="1"/>
+    <w:lsdException w:name="Table Columns 3" w:semiHidden="1" w:unhideWhenUsed="1"/>
+    <w:lsdException w:name="Table Columns 4" w:semiHidden="1" w:unhideWhenUsed="1"/>
+    <w:lsdException w:name="Table Columns 5" w:semiHidden="1" w:unhideWhenUsed="1"/>
+    <w:lsdException w:name="Table Grid 1" w:semiHidden="1" w:unhideWhenUsed="1"/>
+    <w:lsdException w:name="Table Grid 2" w:semiHidden="1" w:unhideWhenUsed="1"/>
+    <w:lsdException w:name="Table Grid 3" w:semiHidden="1" w:unhideWhenUsed="1"/>
+    <w:lsdException w:name="Table Grid 4" w:semiHidden="1" w:unhideWhenUsed="1"/>
+    <w:lsdException w:name="Table Grid 5" w:semiHidden="1" w:unhideWhenUsed="1"/>
+    <w:lsdException w:name="Table Grid 6" w:semiHidden="1" w:unhideWhenUsed="1"/>
+    <w:lsdException w:name="Table Grid 7" w:semiHidden="1" w:unhideWhenUsed="1"/>
+    <w:lsdException w:name="Table Grid 8" w:semiHidden="1" w:unhideWhenUsed="1"/>
+    <w:lsdException w:name="Table List 1" w:semiHidden="1" w:unhideWhenUsed="1"/>
+    <w:lsdException w:name="Table List 2" w:semiHidden="1" w:unhideWhenUsed="1"/>
+    <w:lsdException w:name="Table List 3" w:semiHidden="1" w:unhideWhenUsed="1"/>
+    <w:lsdException w:name="Table List 4" w:semiHidden="1" w:unhideWhenUsed="1"/>
+    <w:lsdException w:name="Table List 5" w:semiHidden="1" w:unhideWhenUsed="1"/>
+    <w:lsdException w:name="Table List 6" w:semiHidden="1" w:unhideWhenUsed="1"/>
+    <w:lsdException w:name="Table List 7" w:semiHidden="1" w:unhideWhenUsed="1"/>
+    <w:lsdException w:name="Table List 8" w:semiHidden="1" w:unhideWhenUsed="1"/>
+    <w:lsdException w:name="Table 3D effects 1" w:semiHidden="1" w:unhideWhenUsed="1"/>
+    <w:lsdException w:name="Table 3D effects 2" w:semiHidden="1" w:unhideWhenUsed="1"/>
+    <w:lsdException w:name="Table 3D effects 3" w:semiHidden="1" w:unhideWhenUsed="1"/>
+    <w:lsdException w:name="Table Contemporary" w:semiHidden="1" w:unhideWhenUsed="1"/>
+    <w:lsdException w:name="Table Elegant" w:semiHidden="1" w:unhideWhenUsed="1"/>
+    <w:lsdException w:name="Table Professional" w:semiHidden="1" w:unhideWhenUsed="1"/>
+    <w:lsdException w:name="Table Subtle 1" w:semiHidden="1" w:unhideWhenUsed="1"/>
+    <w:lsdException w:name="Table Subtle 2" w:semiHidden="1" w:unhideWhenUsed="1"/>
+    <w:lsdException w:name="Table Web 1" w:semiHidden="1" w:unhideWhenUsed="1"/>
+    <w:lsdException w:name="Table Web 2" w:semiHidden="1" w:unhideWhenUsed="1"/>
+    <w:lsdException w:name="Table Web 3" w:semiHidden="1" w:unhideWhenUsed="1"/>
+    <w:lsdException w:name="Table Theme" w:semiHidden="1" w:unhideWhenUsed="1"/>
+    <w:lsdException w:name="Light Shading"/>
+    <w:lsdException w:name="Light List"/>
+    <w:lsdException w:name="Light Grid"/>
+    <w:lsdException w:name="Medium Shading 1"/>
+    <w:lsdException w:name="Medium Shading 2"/>
+    <w:lsdException w:name="Medium List 1"/>
+    <w:lsdException w:name="Medium List 2"/>
+    <w:lsdException w:name="Medium Grid 1"/>
+    <w:lsdException w:name="Medium Grid 2"/>
+    <w:lsdException w:name="Medium Grid 3"/>
+    <w:lsdException w:name="Dark List"/>
+    <w:lsdException w:name="Colorful Shading"/>
+    <w:lsdException w:name="Colorful List"/>
+    <w:lsdException w:name="Colorful Grid"/>
+    <w:lsdException w:name="Light Shading Accent 1"/>
+    <w:lsdException w:name="Light List Accent 1"/>
+    <w:lsdException w:name="Light Grid Accent 1"/>
+    <w:lsdException w:name="Medium Shading 1 Accent 1"/>
+    <w:lsdException w:name="Medium Shading 2 Accent 1"/>
+    <w:lsdException w:name="Medium List 1 Accent 1"/>
+    <w:lsdException w:name="Medium List 2 Accent 1"/>
+    <w:lsdException w:name="Medium Grid 1 Accent 1"/>
+    <w:lsdException w:name="Medium Grid 2 Accent 1"/>
+    <w:lsdException w:name="Medium Grid 3 Accent 1"/>
+    <w:lsdException w:name="Dark List Accent 1"/>
+    <w:lsdException w:name="Colorful Shading Accent 1"/>
+    <w:lsdException w:name="Colorful List Accent 1"/>
+    <w:lsdException w:name="Colorful Grid Accent 1"/>
+    <w:lsdException w:name="Light Shading Accent 2"/>
+    <w:lsdException w:name="Light List Accent 2"/>
+    <w:lsdException w:name="Light Grid Accent 2"/>
+    <w:lsdException w:name="Medium Shading 1 Accent 2"/>
+    <w:lsdException w:name="Medium Shading 2 Accent 2"/>
+    <w:lsdException w:name="Medium List 1 Accent 2"/>
+    <w:lsdException w:name="Medium List 2 Accent 2"/>
+    <w:lsdException w:name="Medium Grid 1 Accent 2"/>
+    <w:lsdException w:name="Medium Grid 2 Accent 2"/>
+    <w:lsdException w:name="Medium Grid 3 Accent 2"/>
+    <w:lsdException w:name="Dark List Accent 2"/>
+    <w:lsdException w:name="Colorful Shading Accent 2"/>
+    <w:lsdException w:name="Colorful List Accent 2"/>
+    <w:lsdException w:name="Colorful Grid Accent 2"/>
+    <w:lsdException w:name="Light Shading Accent 3"/>
+    <w:lsdException w:name="Light List Accent 3"/>
+    <w:lsdException w:name="Light Grid Accent 3"/>
+    <w:lsdException w:name="Medium Shading 1 Accent 3"/>
+    <w:lsdException w:name="Medium Shading 2 Accent 3"/>
+    <w:lsdException w:name="Medium List 1 Accent 3"/>
+    <w:lsdException w:name="Medium List 2 Accent 3"/>
+    <w:lsdException w:name="Medium Grid 1 Accent 3"/>
+    <w:lsdException w:name="Medium Grid 2 Accent 3"/>
+    <w:lsdException w:name="Medium Grid 3 Accent 3"/>
+    <w:lsdException w:name="Dark List Accent 3"/>
+    <w:lsdException w:name="Colorful Shading Accent 3"/>
+    <w:lsdException w:name="Colorful List Accent 3"/>
+    <w:lsdException w:name="Colorful Grid Accent 3"/>
+    <w:lsdException w:name="Light Shading Accent 4"/>
+    <w:lsdException w:name="Light List Accent 4"/>
+    <w:lsdException w:name="Light Grid Accent 4"/>
+    <w:lsdException w:name="Medium Shading 1 Accent 4"/>
+    <w:lsdException w:name="Medium Shading 2 Accent 4"/>
+    <w:lsdException w:name="Medium List 1 Accent 4"/>
+    <w:lsdException w:name="Medium List 2 Accent 4"/>
+    <w:lsdException w:name="Medium Grid 1 Accent 4"/>
+    <w:lsdException w:name="Medium Grid 2 Accent 4"/>
+    <w:lsdException w:name="Medium Grid 3 Accent 4"/>
+    <w:lsdException w:name="Dark List Accent 4"/>
+    <w:lsdException w:name="Colorful Shading Accent 4"/>
+    <w:lsdException w:name="Colorful List Accent 4"/>
+    <w:lsdException w:name="Colorful Grid Accent 4"/>
+    <w:lsdException w:name="Light Shading Accent 5"/>
+    <w:lsdException w:name="Light List Accent 5"/>
+    <w:lsdException w:name="Light Grid Accent 5"/>
+    <w:lsdException w:name="Medium Shading 1 Accent 5"/>
+    <w:lsdException w:name="Medium Shading 2 Accent 5"/>
+    <w:lsdException w:name="Medium List 1 Accent 5"/>
+    <w:lsdException w:name="Medium List 2 Accent 5"/>
+    <w:lsdException w:name="Medium Grid 1 Accent 5"/>
+    <w:lsdException w:name="Medium Grid 2 Accent 5"/>
+    <w:lsdException w:name="Medium Grid 3 Accent 5"/>
+    <w:lsdException w:name="Dark List Accent 5"/>
+    <w:lsdException w:name="Colorful Shading Accent 5"/>
+    <w:lsdException w:name="Colorful List Accent 5"/>
+    <w:lsdException w:name="Colorful Grid Accent 5"/>
+    <w:lsdException w:name="Light Shading Accent 6"/>
+    <w:lsdException w:name="Light List Accent 6"/>
+    <w:lsdException w:name="Light Grid Accent 6"/>
+    <w:lsdException w:name="Medium Shading 1 Accent 6"/>
+    <w:lsdException w:name="Medium Shading 2 Accent 6"/>
+    <w:lsdException w:name="Medium List 1 Accent 6"/>
+    <w:lsdException w:name="Medium List 2 Accent 6"/>
+    <w:lsdException w:name="Medium Grid 1 Accent 6"/>
+    <w:lsdException w:name="Medium Grid 2 Accent 6"/>
+    <w:lsdException w:name="Medium Grid 3 Accent 6"/>
+    <w:lsdException w:name="Dark List Accent 6"/>
+    <w:lsdException w:name="Colorful Shading Accent 6"/>
+    <w:lsdException w:name="Colorful List Accent 6"/>
+    <w:lsdException w:name="Colorful Grid Accent 6"/>
+    <w:lsdException w:name="Grid Table 4" w:uiPriority="49"/>
+    <w:lsdException w:name="Grid Table 5 Dark" w:uiPriority="50"/>
+    <w:lsdException w:name="Grid Table 6 Colorful" w:uiPriority="51"/>
+    <w:lsdException w:name="Grid Table 7 Colorful" w:uiPriority="52"/>
+    <w:lsdException w:name="Grid Table 1 Light Accent 1" w:uiPriority="46"/>
+    <w:lsdException w:name="Grid Table 2 Accent 1" w:uiPriority="47"/>
+    <w:lsdException w:name="Grid Table 3 Accent 1" w:uiPriority="48"/>
+    <w:lsdException w:name="Grid Table 4 Accent 1" w:uiPriority="49"/>
+    <w:lsdException w:name="Grid Table 5 Dark Accent 1" w:uiPriority="50"/>
+    <w:lsdException w:name="Grid Table 6 Colorful Accent 1" w:uiPriority="51"/>
+    <w:lsdException w:name="Grid Table 7 Colorful Accent 1" w:uiPriority="52"/>
+    <w:lsdException w:name="Grid Table 1 Light Accent 2" w:uiPriority="46"/>
+    <w:lsdException w:name="Grid Table 2 Accent 2" w:uiPriority="47"/>
+    <w:lsdException w:name="Grid Table 3 Accent 2" w:uiPriority="48"/>
+    <w:lsdException w:name="Grid Table 4 Accent 2" w:uiPriority="49"/>
+    <w:lsdException w:name="Grid Table 5 Dark Accent 2" w:uiPriority="50"/>
+    <w:lsdException w:name="Grid Table 6 Colorful Accent 2" w:uiPriority="51"/>
+    <w:lsdException w:name="Grid Table 7 Colorful Accent 2" w:uiPriority="52"/>
+    <w:lsdException w:name="Grid Table 1 Light Accent 3" w:uiPriority="46"/>
+    <w:lsdException w:name="Grid Table 2 Accent 3" w:uiPriority="47"/>
+    <w:lsdException w:name="Grid Table 3 Accent 3" w:uiPriority="48"/>
+    <w:lsdException w:name="Grid Table 4 Accent 3" w:uiPriority="49"/>
+    <w:lsdException w:name="Grid Table 5 Dark Accent 3" w:uiPriority="50"/>
+    <w:lsdException w:name="Grid Table 6 Colorful Accent 3" w:uiPriority="51"/>
+    <w:lsdException w:name="Grid Table 7 Colorful Accent 3" w:uiPriority="52"/>
+    <w:lsdException w:name="Grid Table 1 Light Accent 4" w:uiPriority="46"/>
+    <w:lsdException w:name="Grid Table 2 Accent 4" w:uiPriority="47"/>
+    <w:lsdException w:name="Grid Table 3 Accent 4" w:uiPriority="48"/>
+    <w:lsdException w:name="Grid Table 4 Accent 4" w:uiPriority="49"/>
+    <w:lsdException w:name="Grid Table 5 Dark Accent 4" w:uiPriority="50"/>
+    <w:lsdException w:name="Grid Table 6 Colorful Accent 4" w:uiPriority="51"/>
+    <w:lsdException w:name="Grid Table 7 Colorful Accent 4" w:uiPriority="52"/>
+    <w:lsdException w:name="Grid Table 1 Light Accent 5" w:uiPriority="46"/>
+    <w:lsdException w:name="Grid Table 2 Accent 5" w:uiPriority="47"/>
+    <w:lsdException w:name="Grid Table 3 Accent 5" w:uiPriority="48"/>
+    <w:lsdException w:name="Grid Table 4 Accent 5" w:uiPriority="49"/>
+    <w:lsdException w:name="Grid Table 5 Dark Accent 5" w:uiPriority="50"/>
+    <w:lsdException w:name="Grid Table 6 Colorful Accent 5" w:uiPriority="51"/>
+    <w:lsdException w:name="Grid Table 7 Colorful Accent 5" w:uiPriority="52"/>
+    <w:lsdException w:name="Grid Table 1 Light Accent 6" w:uiPriority="46"/>
+    <w:lsdException w:name="Grid Table 2 Accent 6" w:uiPriority="47"/>
+    <w:lsdException w:name="Grid Table 3 Accent 6" w:uiPriority="48"/>
+    <w:lsdException w:name="Grid Table 4 Accent 6" w:uiPriority="49"/>
+    <w:lsdException w:name="Grid Table 5 Dark Accent 6" w:uiPriority="50"/>
+    <w:lsdException w:name="Grid Table 6 Colorful Accent 6" w:uiPriority="51"/>
+    <w:lsdException w:name="Grid Table 7 Colorful Accent 6" w:uiPriority="52"/>
+    <w:lsdException w:name="List Table 1 Light" w:uiPriority="46"/>
+    <w:lsdException w:name="List Table 2" w:uiPriority="47"/>
+    <w:lsdException w:name="List Table 3" w:uiPriority="48"/>
+    <w:lsdException w:name="List Table 4" w:uiPriority="49"/>
+    <w:lsdException w:name="List Table 5 Dark" w:uiPriority="50"/>
+    <w:lsdException w:name="List Table 6 Colorful" w:uiPriority="51"/>
+    <w:lsdException w:name="List Table 7 Colorful" w:uiPriority="52"/>
+    <w:lsdException w:name="List Table 1 Light Accent 1" w:uiPriority="46"/>
+    <w:lsdException w:name="List Table 2 Accent 1" w:uiPriority="47"/>
+    <w:lsdException w:name="List Table 3 Accent 1" w:uiPriority="48"/>
+    <w:lsdException w:name="List Table 4 Accent 1" w:uiPriority="49"/>
+    <w:lsdException w:name="List Table 5 Dark Accent 1" w:uiPriority="50"/>
+    <w:lsdException w:name="List Table 6 Colorful Accent 1" w:uiPriority="51"/>
+    <w:lsdException w:name="List Table 7 Colorful Accent 1" w:uiPriority="52"/>
+    <w:lsdException w:name="List Table 1 Light Accent 2" w:uiPriority="46"/>
+    <w:lsdException w:name="List Table 2 Accent 2" w:uiPriority="47"/>
+    <w:lsdException w:name="List Table 3 Accent 2" w:uiPriority="48"/>
+    <w:lsdException w:name="List Table 4 Accent 2" w:uiPriority="49"/>
+    <w:lsdException w:name="List Table 5 Dark Accent 2" w:uiPriority="50"/>
+    <w:lsdException w:name="List Table 6 Colorful Accent 2" w:uiPriority="51"/>
+    <w:lsdException w:name="List Table 7 Colorful Accent 2" w:uiPriority="52"/>
+    <w:lsdException w:name="List Table 1 Light Accent 3" w:uiPriority="46"/>
+    <w:lsdException w:name="List Table 2 Accent 3" w:uiPriority="47"/>
+    <w:lsdException w:name="List Table 3 Accent 3" w:uiPriority="48"/>
+    <w:lsdException w:name="List Table 4 Accent 3" w:uiPriority="49"/>
+    <w:lsdException w:name="List Table 5 Dark Accent 3" w:uiPriority="50"/>
+    <w:lsdException w:name="List Table 6 Colorful Accent 3" w:uiPriority="51"/>
+    <w:lsdException w:name="List Table 7 Colorful Accent 3" w:uiPriority="52"/>
+    <w:lsdException w:name="List Table 1 Light Accent 4" w:uiPriority="46"/>
+    <w:lsdException w:name="List Table 2 Accent 4" w:uiPriority="47"/>
+    <w:lsdException w:name="List Table 3 Accent 4" w:uiPriority="48"/>
+    <w:lsdException w:name="List Table 4 Accent 4" w:uiPriority="49"/>
+    <w:lsdException w:name="List Table 5 Dark Accent 4" w:uiPriority="50"/>
+    <w:lsdException w:name="List Table 6 Colorful Accent 4" w:uiPriority="51"/>
+    <w:lsdException w:name="List Table 7 Colorful Accent 4" w:uiPriority="52"/>
+    <w:lsdException w:name="List Table 1 Light Accent 5" w:uiPriority="46"/>
+    <w:lsdException w:name="List Table 2 Accent 5" w:uiPriority="47"/>
+    <w:lsdException w:name="List Table 3 Accent 5" w:uiPriority="48"/>
+    <w:lsdException w:name="List Table 4 Accent 5" w:uiPriority="49"/>
+    <w:lsdException w:name="List Table 5 Dark Accent 5" w:uiPriority="50"/>
+    <w:lsdException w:name="List Table 6 Colorful Accent 5" w:uiPriority="51"/>
+    <w:lsdException w:name="List Table 7 Colorful Accent 5" w:uiPriority="52"/>
+    <w:lsdException w:name="List Table 1 Light Accent 6" w:uiPriority="46"/>
+    <w:lsdException w:name="List Table 2 Accent 6" w:uiPriority="47"/>
+    <w:lsdException w:name="List Table 3 Accent 6" w:uiPriority="48"/>
+    <w:lsdException w:name="List Table 4 Accent 6" w:uiPriority="49"/>
+    <w:lsdException w:name="List Table 5 Dark Accent 6" w:uiPriority="50"/>
+    <w:lsdException w:name="List Table 6 Colorful Accent 6" w:uiPriority="51"/>
+    <w:lsdException w:name="List Table 7 Colorful Accent 6" w:uiPriority="52"/>
+    <w:lsdException w:name="Mention" w:semiHidden="1" w:uiPriority="99" w:unhideWhenUsed="1"/>
+    <w:lsdException w:name="Smart Hyperlink" w:semiHidden="1" w:uiPriority="99" w:unhideWhenUsed="1"/>
+    <w:lsdException w:name="Hashtag" w:semiHidden="1" w:uiPriority="99" w:unhideWhenUsed="1"/>
+    <w:lsdException w:name="Unresolved Mention" w:semiHidden="1" w:uiPriority="99" w:unhideWhenUsed="1"/>
+    <w:lsdException w:name="Smart Link" w:semiHidden="1" w:uiPriority="99" w:unhideWhenUsed="1"/>
+  </w:latentStyles>
+  <w:style w:type="paragraph" w:default="1" w:styleId="Normal">
     <w:name w:val="Normal"/>
     <w:qFormat/>
   </w:style>
-  <w:style w:styleId="BodyText" w:type="paragraph">
+  <w:style w:type="paragraph" w:styleId="Heading1">
+    <w:name w:val="heading 1"/>
+    <w:basedOn w:val="Normal"/>
+    <w:next w:val="BodyText"/>
+    <w:uiPriority w:val="9"/>
+    <w:qFormat/>
+    <w:pPr>
+      <w:keepNext/>
+      <w:keepLines/>
+      <w:spacing w:before="480" w:after="0"/>
+      <w:outlineLvl w:val="0"/>
+    </w:pPr>
+    <w:rPr>
+      <w:rFonts w:asciiTheme="majorHAnsi" w:eastAsiaTheme="majorEastAsia" w:hAnsiTheme="majorHAnsi" w:cstheme="majorBidi"/>
+      <w:b/>
+      <w:bCs/>
+      <w:color w:val="4F81BD" w:themeColor="accent1"/>
+      <w:sz w:val="32"/>
+      <w:szCs w:val="32"/>
+    </w:rPr>
+  </w:style>
+  <w:style w:type="paragraph" w:styleId="Heading2">
+    <w:name w:val="heading 2"/>
+    <w:basedOn w:val="Normal"/>
+    <w:next w:val="BodyText"/>
+    <w:uiPriority w:val="9"/>
+    <w:unhideWhenUsed/>
+    <w:qFormat/>
+    <w:pPr>
+      <w:keepNext/>
+      <w:keepLines/>
+      <w:spacing w:before="200" w:after="0"/>
+      <w:outlineLvl w:val="1"/>
+    </w:pPr>
+    <w:rPr>
+      <w:rFonts w:asciiTheme="majorHAnsi" w:eastAsiaTheme="majorEastAsia" w:hAnsiTheme="majorHAnsi" w:cstheme="majorBidi"/>
+      <w:b/>
+      <w:bCs/>
+      <w:color w:val="4F81BD" w:themeColor="accent1"/>
+      <w:sz w:val="28"/>
+      <w:szCs w:val="28"/>
+    </w:rPr>
+  </w:style>
+  <w:style w:type="paragraph" w:styleId="Heading3">
+    <w:name w:val="heading 3"/>
+    <w:basedOn w:val="Normal"/>
+    <w:next w:val="BodyText"/>
+    <w:uiPriority w:val="9"/>
+    <w:unhideWhenUsed/>
+    <w:qFormat/>
+    <w:pPr>
+      <w:keepNext/>
+      <w:keepLines/>
+      <w:spacing w:before="200" w:after="0"/>
+      <w:outlineLvl w:val="2"/>
+    </w:pPr>
+    <w:rPr>
+      <w:rFonts w:asciiTheme="majorHAnsi" w:eastAsiaTheme="majorEastAsia" w:hAnsiTheme="majorHAnsi" w:cstheme="majorBidi"/>
+      <w:b/>
+      <w:bCs/>
+      <w:color w:val="4F81BD" w:themeColor="accent1"/>
+    </w:rPr>
+  </w:style>
+  <w:style w:type="paragraph" w:styleId="Heading4">
+    <w:name w:val="heading 4"/>
+    <w:basedOn w:val="Normal"/>
+    <w:next w:val="BodyText"/>
+    <w:uiPriority w:val="9"/>
+    <w:unhideWhenUsed/>
+    <w:qFormat/>
+    <w:pPr>
+      <w:keepNext/>
+      <w:keepLines/>
+      <w:spacing w:before="200" w:after="0"/>
+      <w:outlineLvl w:val="3"/>
+    </w:pPr>
+    <w:rPr>
+      <w:rFonts w:asciiTheme="majorHAnsi" w:eastAsiaTheme="majorEastAsia" w:hAnsiTheme="majorHAnsi" w:cstheme="majorBidi"/>
+      <w:bCs/>
+      <w:i/>
+      <w:color w:val="4F81BD" w:themeColor="accent1"/>
+    </w:rPr>
+  </w:style>
+  <w:style w:type="paragraph" w:styleId="Heading5">
+    <w:name w:val="heading 5"/>
+    <w:basedOn w:val="Normal"/>
+    <w:next w:val="BodyText"/>
+    <w:uiPriority w:val="9"/>
+    <w:unhideWhenUsed/>
+    <w:qFormat/>
+    <w:pPr>
+      <w:keepNext/>
+      <w:keepLines/>
+      <w:spacing w:before="200" w:after="0"/>
+      <w:outlineLvl w:val="4"/>
+    </w:pPr>
+    <w:rPr>
+      <w:rFonts w:asciiTheme="majorHAnsi" w:eastAsiaTheme="majorEastAsia" w:hAnsiTheme="majorHAnsi" w:cstheme="majorBidi"/>
+      <w:iCs/>
+      <w:color w:val="4F81BD" w:themeColor="accent1"/>
+    </w:rPr>
+  </w:style>
+  <w:style w:type="paragraph" w:styleId="Heading6">
+    <w:name w:val="heading 6"/>
+    <w:basedOn w:val="Normal"/>
+    <w:next w:val="BodyText"/>
+    <w:uiPriority w:val="9"/>
+    <w:unhideWhenUsed/>
+    <w:qFormat/>
+    <w:pPr>
+      <w:keepNext/>
+      <w:keepLines/>
+      <w:spacing w:before="200" w:after="0"/>
+      <w:outlineLvl w:val="5"/>
+    </w:pPr>
+    <w:rPr>
+      <w:rFonts w:asciiTheme="majorHAnsi" w:eastAsiaTheme="majorEastAsia" w:hAnsiTheme="majorHAnsi" w:cstheme="majorBidi"/>
+      <w:color w:val="4F81BD" w:themeColor="accent1"/>
+    </w:rPr>
+  </w:style>
+  <w:style w:type="paragraph" w:styleId="Heading7">
+    <w:name w:val="heading 7"/>
+    <w:basedOn w:val="Normal"/>
+    <w:next w:val="BodyText"/>
+    <w:uiPriority w:val="9"/>
+    <w:unhideWhenUsed/>
+    <w:qFormat/>
+    <w:pPr>
+      <w:keepNext/>
+      <w:keepLines/>
+      <w:spacing w:before="200" w:after="0"/>
+      <w:outlineLvl w:val="6"/>
+    </w:pPr>
+    <w:rPr>
+      <w:rFonts w:asciiTheme="majorHAnsi" w:eastAsiaTheme="majorEastAsia" w:hAnsiTheme="majorHAnsi" w:cstheme="majorBidi"/>
+      <w:color w:val="4F81BD" w:themeColor="accent1"/>
+    </w:rPr>
+  </w:style>
+  <w:style w:type="paragraph" w:styleId="Heading8">
+    <w:name w:val="heading 8"/>
+    <w:basedOn w:val="Normal"/>
+    <w:next w:val="BodyText"/>
+    <w:uiPriority w:val="9"/>
+    <w:unhideWhenUsed/>
+    <w:qFormat/>
+    <w:pPr>
+      <w:keepNext/>
+      <w:keepLines/>
+      <w:spacing w:before="200" w:after="0"/>
+      <w:outlineLvl w:val="7"/>
+    </w:pPr>
+    <w:rPr>
+      <w:rFonts w:asciiTheme="majorHAnsi" w:eastAsiaTheme="majorEastAsia" w:hAnsiTheme="majorHAnsi" w:cstheme="majorBidi"/>
+      <w:color w:val="4F81BD" w:themeColor="accent1"/>
+    </w:rPr>
+  </w:style>
+  <w:style w:type="paragraph" w:styleId="Heading9">
+    <w:name w:val="heading 9"/>
+    <w:basedOn w:val="Normal"/>
+    <w:next w:val="BodyText"/>
+    <w:uiPriority w:val="9"/>
+    <w:unhideWhenUsed/>
+    <w:qFormat/>
+    <w:pPr>
+      <w:keepNext/>
+      <w:keepLines/>
+      <w:spacing w:before="200" w:after="0"/>
+      <w:outlineLvl w:val="8"/>
+    </w:pPr>
+    <w:rPr>
+      <w:rFonts w:asciiTheme="majorHAnsi" w:eastAsiaTheme="majorEastAsia" w:hAnsiTheme="majorHAnsi" w:cstheme="majorBidi"/>
+      <w:color w:val="4F81BD" w:themeColor="accent1"/>
+    </w:rPr>
+  </w:style>
+  <w:style w:type="character" w:default="1" w:styleId="DefaultParagraphFont">
+    <w:name w:val="Default Paragraph Font"/>
+    <w:uiPriority w:val="1"/>
+    <w:semiHidden/>
+    <w:unhideWhenUsed/>
+  </w:style>
+  <w:style w:type="table" w:default="1" w:styleId="TableNormal">
+    <w:name w:val="Normal Table"/>
+    <w:uiPriority w:val="99"/>
+    <w:semiHidden/>
+    <w:unhideWhenUsed/>
+    <w:tblPr>
+      <w:tblInd w:w="0" w:type="dxa"/>
+      <w:tblCellMar>
+        <w:top w:w="0" w:type="dxa"/>
+        <w:left w:w="108" w:type="dxa"/>
+        <w:bottom w:w="0" w:type="dxa"/>
+        <w:right w:w="108" w:type="dxa"/>
+      </w:tblCellMar>
+    </w:tblPr>
+  </w:style>
+  <w:style w:type="numbering" w:default="1" w:styleId="NoList">
+    <w:name w:val="No List"/>
+    <w:uiPriority w:val="99"/>
+    <w:semiHidden/>
+    <w:unhideWhenUsed/>
+  </w:style>
+  <w:style w:type="paragraph" w:styleId="BodyText">
     <w:name w:val="Body Text"/>
     <w:basedOn w:val="Normal"/>
-    <w:link w:val="BodyTextChar"/>
-    <w:pPr>
-      <w:spacing w:after="180" w:before="180"/>
-    </w:pPr>
-    <w:qFormat/>
-  </w:style>
-  <w:style w:customStyle="1" w:styleId="FirstParagraph" w:type="paragraph">
+    <w:qFormat/>
+    <w:pPr>
+      <w:spacing w:before="180" w:after="180"/>
+    </w:pPr>
+  </w:style>
+  <w:style w:type="paragraph" w:customStyle="1" w:styleId="FirstParagraph">
     <w:name w:val="First Paragraph"/>
     <w:basedOn w:val="BodyText"/>
     <w:next w:val="BodyText"/>
     <w:qFormat/>
   </w:style>
-  <w:style w:customStyle="1" w:styleId="Compact" w:type="paragraph">
+  <w:style w:type="paragraph" w:customStyle="1" w:styleId="Compact">
     <w:name w:val="Compact"/>
     <w:basedOn w:val="BodyText"/>
     <w:qFormat/>
     <w:pPr>
-      <w:spacing w:after="36" w:before="36"/>
-    </w:pPr>
-  </w:style>
-  <w:style w:styleId="Title" w:type="paragraph">
+      <w:spacing w:before="36" w:after="36"/>
+    </w:pPr>
+  </w:style>
+  <w:style w:type="paragraph" w:styleId="Title">
     <w:name w:val="Title"/>
     <w:basedOn w:val="Normal"/>
     <w:next w:val="BodyText"/>
@@ -405,35 +880,32 @@
     <w:pPr>
       <w:keepNext/>
       <w:keepLines/>
-      <w:spacing w:after="240" w:before="480"/>
+      <w:spacing w:before="480" w:after="240"/>
       <w:jc w:val="center"/>
     </w:pPr>
     <w:rPr>
-      <w:rFonts w:asciiTheme="majorHAnsi" w:cstheme="majorBidi" w:eastAsiaTheme="majorEastAsia" w:hAnsiTheme="majorHAnsi"/>
+      <w:rFonts w:asciiTheme="majorHAnsi" w:eastAsiaTheme="majorEastAsia" w:hAnsiTheme="majorHAnsi" w:cstheme="majorBidi"/>
       <w:b/>
       <w:bCs/>
-      <w:color w:themeColor="accent1" w:themeShade="B5" w:val="345A8A"/>
+      <w:color w:val="345A8A" w:themeColor="accent1" w:themeShade="B5"/>
       <w:sz w:val="36"/>
       <w:szCs w:val="36"/>
     </w:rPr>
   </w:style>
-  <w:style w:styleId="Subtitle" w:type="paragraph">
+  <w:style w:type="paragraph" w:styleId="Subtitle">
     <w:name w:val="Subtitle"/>
     <w:basedOn w:val="Title"/>
     <w:next w:val="BodyText"/>
     <w:qFormat/>
     <w:pPr>
-      <w:keepNext/>
-      <w:keepLines/>
-      <w:spacing w:after="240" w:before="240"/>
-      <w:jc w:val="center"/>
+      <w:spacing w:before="240"/>
     </w:pPr>
     <w:rPr>
       <w:sz w:val="30"/>
       <w:szCs w:val="30"/>
     </w:rPr>
   </w:style>
-  <w:style w:customStyle="1" w:styleId="Author" w:type="paragraph">
+  <w:style w:type="paragraph" w:customStyle="1" w:styleId="Author">
     <w:name w:val="Author"/>
     <w:next w:val="BodyText"/>
     <w:qFormat/>
@@ -443,7 +915,7 @@
       <w:jc w:val="center"/>
     </w:pPr>
   </w:style>
-  <w:style w:styleId="Date" w:type="paragraph">
+  <w:style w:type="paragraph" w:styleId="Date">
     <w:name w:val="Date"/>
     <w:next w:val="BodyText"/>
     <w:qFormat/>
@@ -453,7 +925,7 @@
       <w:jc w:val="center"/>
     </w:pPr>
   </w:style>
-  <w:style w:customStyle="1" w:styleId="AbstractTitle" w:type="paragraph">
+  <w:style w:type="paragraph" w:customStyle="1" w:styleId="AbstractTitle">
     <w:name w:val="Abstract Title"/>
     <w:basedOn w:val="Normal"/>
     <w:next w:val="Abstract"/>
@@ -461,18 +933,17 @@
     <w:pPr>
       <w:keepNext/>
       <w:keepLines/>
+      <w:spacing w:before="300" w:after="0"/>
       <w:jc w:val="center"/>
-      <w:spacing w:after="0" w:before="300"/>
-    </w:pPr>
-    <w:rPr>
+    </w:pPr>
+    <w:rPr>
+      <w:b/>
+      <w:color w:val="345A8A"/>
       <w:sz w:val="20"/>
       <w:szCs w:val="20"/>
-      <w:b/>
-      <w:color w:val="345A8A"/>
-      &gt;
-    </w:rPr>
-  </w:style>
-  <w:style w:customStyle="1" w:styleId="Abstract" w:type="paragraph">
+    </w:rPr>
+  </w:style>
+  <w:style w:type="paragraph" w:customStyle="1" w:styleId="Abstract">
     <w:name w:val="Abstract"/>
     <w:basedOn w:val="Normal"/>
     <w:next w:val="BodyText"/>
@@ -480,210 +951,19 @@
     <w:pPr>
       <w:keepNext/>
       <w:keepLines/>
-      <w:spacing w:after="300" w:before="100"/>
+      <w:spacing w:before="100" w:after="300"/>
     </w:pPr>
     <w:rPr>
       <w:sz w:val="20"/>
       <w:szCs w:val="20"/>
     </w:rPr>
   </w:style>
-  <w:style w:styleId="Bibliography" w:type="paragraph">
+  <w:style w:type="paragraph" w:styleId="Bibliography">
     <w:name w:val="Bibliography"/>
     <w:basedOn w:val="Normal"/>
-    <w:next w:val="Bibliography"/>
-    <w:qFormat/>
-    <w:pPr/>
-    <w:rPr/>
-  </w:style>
-  <w:style w:styleId="Heading1" w:type="paragraph">
-    <w:name w:val="Heading 1"/>
-    <w:basedOn w:val="Normal"/>
-    <w:next w:val="BodyText"/>
-    <w:uiPriority w:val="9"/>
-    <w:qFormat/>
-    <w:pPr>
-      <w:keepNext/>
-      <w:keepLines/>
-      <w:spacing w:after="0" w:before="480"/>
-      <w:outlineLvl w:val="0"/>
-    </w:pPr>
-    <w:rPr>
-      <w:rFonts w:asciiTheme="majorHAnsi" w:cstheme="majorBidi" w:eastAsiaTheme="majorEastAsia" w:hAnsiTheme="majorHAnsi"/>
-      <w:b/>
-      <w:bCs/>
-      <w:color w:themeColor="accent1" w:val="4F81BD"/>
-      <w:sz w:val="32"/>
-      <w:szCs w:val="32"/>
-    </w:rPr>
-  </w:style>
-  <w:style w:styleId="Heading2" w:type="paragraph">
-    <w:name w:val="Heading 2"/>
-    <w:basedOn w:val="Normal"/>
-    <w:next w:val="BodyText"/>
-    <w:uiPriority w:val="9"/>
-    <w:unhideWhenUsed/>
-    <w:qFormat/>
-    <w:pPr>
-      <w:keepNext/>
-      <w:keepLines/>
-      <w:spacing w:after="0" w:before="200"/>
-      <w:outlineLvl w:val="1"/>
-    </w:pPr>
-    <w:rPr>
-      <w:rFonts w:asciiTheme="majorHAnsi" w:cstheme="majorBidi" w:eastAsiaTheme="majorEastAsia" w:hAnsiTheme="majorHAnsi"/>
-      <w:b/>
-      <w:bCs/>
-      <w:color w:themeColor="accent1" w:val="4F81BD"/>
-      <w:sz w:val="28"/>
-      <w:szCs w:val="28"/>
-    </w:rPr>
-  </w:style>
-  <w:style w:styleId="Heading3" w:type="paragraph">
-    <w:name w:val="Heading 3"/>
-    <w:basedOn w:val="Normal"/>
-    <w:next w:val="BodyText"/>
-    <w:uiPriority w:val="9"/>
-    <w:unhideWhenUsed/>
-    <w:qFormat/>
-    <w:pPr>
-      <w:keepNext/>
-      <w:keepLines/>
-      <w:spacing w:after="0" w:before="200"/>
-      <w:outlineLvl w:val="2"/>
-    </w:pPr>
-    <w:rPr>
-      <w:rFonts w:asciiTheme="majorHAnsi" w:cstheme="majorBidi" w:eastAsiaTheme="majorEastAsia" w:hAnsiTheme="majorHAnsi"/>
-      <w:b/>
-      <w:bCs/>
-      <w:color w:themeColor="accent1" w:val="4F81BD"/>
-      <w:sz w:val="24"/>
-      <w:szCs w:val="24"/>
-    </w:rPr>
-  </w:style>
-  <w:style w:styleId="Heading4" w:type="paragraph">
-    <w:name w:val="Heading 4"/>
-    <w:basedOn w:val="Normal"/>
-    <w:next w:val="BodyText"/>
-    <w:uiPriority w:val="9"/>
-    <w:unhideWhenUsed/>
-    <w:qFormat/>
-    <w:pPr>
-      <w:keepNext/>
-      <w:keepLines/>
-      <w:spacing w:after="0" w:before="200"/>
-      <w:outlineLvl w:val="3"/>
-    </w:pPr>
-    <w:rPr>
-      <w:rFonts w:asciiTheme="majorHAnsi" w:cstheme="majorBidi" w:eastAsiaTheme="majorEastAsia" w:hAnsiTheme="majorHAnsi"/>
-      <w:i/>
-      <w:bCs/>
-      <w:color w:themeColor="accent1" w:val="4F81BD"/>
-      <w:sz w:val="24"/>
-      <w:szCs w:val="24"/>
-    </w:rPr>
-  </w:style>
-  <w:style w:styleId="Heading5" w:type="paragraph">
-    <w:name w:val="Heading 5"/>
-    <w:basedOn w:val="Normal"/>
-    <w:next w:val="BodyText"/>
-    <w:uiPriority w:val="9"/>
-    <w:unhideWhenUsed/>
-    <w:qFormat/>
-    <w:pPr>
-      <w:keepNext/>
-      <w:keepLines/>
-      <w:spacing w:after="0" w:before="200"/>
-      <w:outlineLvl w:val="4"/>
-    </w:pPr>
-    <w:rPr>
-      <w:rFonts w:asciiTheme="majorHAnsi" w:cstheme="majorBidi" w:eastAsiaTheme="majorEastAsia" w:hAnsiTheme="majorHAnsi"/>
-      <w:iCs/>
-      <w:color w:themeColor="accent1" w:val="4F81BD"/>
-      <w:sz w:val="24"/>
-      <w:szCs w:val="24"/>
-    </w:rPr>
-  </w:style>
-  <w:style w:styleId="Heading6" w:type="paragraph">
-    <w:name w:val="Heading 6"/>
-    <w:basedOn w:val="Normal"/>
-    <w:next w:val="BodyText"/>
-    <w:uiPriority w:val="9"/>
-    <w:unhideWhenUsed/>
-    <w:qFormat/>
-    <w:pPr>
-      <w:keepNext/>
-      <w:keepLines/>
-      <w:spacing w:after="0" w:before="200"/>
-      <w:outlineLvl w:val="5"/>
-    </w:pPr>
-    <w:rPr>
-      <w:rFonts w:asciiTheme="majorHAnsi" w:cstheme="majorBidi" w:eastAsiaTheme="majorEastAsia" w:hAnsiTheme="majorHAnsi"/>
-      <w:color w:themeColor="accent1" w:val="4F81BD"/>
-      <w:sz w:val="24"/>
-      <w:szCs w:val="24"/>
-    </w:rPr>
-  </w:style>
-  <w:style w:styleId="Heading7" w:type="paragraph">
-    <w:name w:val="Heading 7"/>
-    <w:basedOn w:val="Normal"/>
-    <w:next w:val="BodyText"/>
-    <w:uiPriority w:val="9"/>
-    <w:unhideWhenUsed/>
-    <w:qFormat/>
-    <w:pPr>
-      <w:keepNext/>
-      <w:keepLines/>
-      <w:spacing w:after="0" w:before="200"/>
-      <w:outlineLvl w:val="6"/>
-    </w:pPr>
-    <w:rPr>
-      <w:rFonts w:asciiTheme="majorHAnsi" w:cstheme="majorBidi" w:eastAsiaTheme="majorEastAsia" w:hAnsiTheme="majorHAnsi"/>
-      <w:color w:themeColor="accent1" w:val="4F81BD"/>
-      <w:sz w:val="24"/>
-      <w:szCs w:val="24"/>
-    </w:rPr>
-  </w:style>
-  <w:style w:styleId="Heading8" w:type="paragraph">
-    <w:name w:val="Heading 8"/>
-    <w:basedOn w:val="Normal"/>
-    <w:next w:val="BodyText"/>
-    <w:uiPriority w:val="9"/>
-    <w:unhideWhenUsed/>
-    <w:qFormat/>
-    <w:pPr>
-      <w:keepNext/>
-      <w:keepLines/>
-      <w:spacing w:after="0" w:before="200"/>
-      <w:outlineLvl w:val="7"/>
-    </w:pPr>
-    <w:rPr>
-      <w:rFonts w:asciiTheme="majorHAnsi" w:cstheme="majorBidi" w:eastAsiaTheme="majorEastAsia" w:hAnsiTheme="majorHAnsi"/>
-      <w:color w:themeColor="accent1" w:val="4F81BD"/>
-      <w:sz w:val="24"/>
-      <w:szCs w:val="24"/>
-    </w:rPr>
-  </w:style>
-  <w:style w:styleId="Heading9" w:type="paragraph">
-    <w:name w:val="Heading 9"/>
-    <w:basedOn w:val="Normal"/>
-    <w:next w:val="BodyText"/>
-    <w:uiPriority w:val="9"/>
-    <w:unhideWhenUsed/>
-    <w:qFormat/>
-    <w:pPr>
-      <w:keepNext/>
-      <w:keepLines/>
-      <w:spacing w:after="0" w:before="200"/>
-      <w:outlineLvl w:val="8"/>
-    </w:pPr>
-    <w:rPr>
-      <w:rFonts w:asciiTheme="majorHAnsi" w:cstheme="majorBidi" w:eastAsiaTheme="majorEastAsia" w:hAnsiTheme="majorHAnsi"/>
-      <w:color w:themeColor="accent1" w:val="4F81BD"/>
-      <w:sz w:val="24"/>
-      <w:szCs w:val="24"/>
-    </w:rPr>
-  </w:style>
-  <w:style w:styleId="BlockText" w:type="paragraph">
+    <w:qFormat/>
+  </w:style>
+  <w:style w:type="paragraph" w:styleId="BlockText">
     <w:name w:val="Block Text"/>
     <w:basedOn w:val="BodyText"/>
     <w:next w:val="BodyText"/>
@@ -691,55 +971,47 @@
     <w:unhideWhenUsed/>
     <w:qFormat/>
     <w:pPr>
-      <w:spacing w:after="100" w:before="100"/>
-      <w:ind w:firstLine="0" w:left="480" w:right="480"/>
-    </w:pPr>
-  </w:style>
-  <w:style w:styleId="FootnoteText" w:type="paragraph">
-    <w:name w:val="Footnote Text"/>
-    <w:basedOn w:val="Normal"/>
-    <w:next w:val="FootnoteText"/>
+      <w:spacing w:before="100" w:after="100"/>
+      <w:ind w:left="480" w:right="480"/>
+    </w:pPr>
+  </w:style>
+  <w:style w:type="paragraph" w:styleId="FootnoteText">
+    <w:name w:val="footnote text"/>
+    <w:basedOn w:val="Normal"/>
     <w:uiPriority w:val="9"/>
     <w:unhideWhenUsed/>
     <w:qFormat/>
   </w:style>
-  <w:style w:default="1" w:styleId="DefaultParagraphFont" w:type="character">
-    <w:name w:val="Default Paragraph Font"/>
+  <w:style w:type="table" w:customStyle="1" w:styleId="Table">
+    <w:name w:val="Table"/>
     <w:semiHidden/>
     <w:unhideWhenUsed/>
-  </w:style>
-  <w:style w:default="1" w:styleId="Table" w:type="table">
-    <w:name w:val="Table"/>
-    <w:basedOn w:val="TableNormal"/>
-    <w:semiHidden/>
-    <w:unhideWhenUsed/>
     <w:qFormat/>
     <w:tblPr>
-      <w:tblInd w:type="dxa" w:w="0"/>
+      <w:tblInd w:w="0" w:type="dxa"/>
       <w:tblCellMar>
-        <w:top w:type="dxa" w:w="0"/>
-        <w:left w:type="dxa" w:w="108"/>
-        <w:bottom w:type="dxa" w:w="0"/>
-        <w:right w:type="dxa" w:w="108"/>
+        <w:top w:w="0" w:type="dxa"/>
+        <w:left w:w="108" w:type="dxa"/>
+        <w:bottom w:w="0" w:type="dxa"/>
+        <w:right w:w="108" w:type="dxa"/>
       </w:tblCellMar>
     </w:tblPr>
     <w:tblStylePr w:type="firstRow">
       <w:tblPr>
         <w:jc w:val="left"/>
-        <w:tblInd w:type="dxa" w:w="0"/>
       </w:tblPr>
       <w:trPr>
         <w:jc w:val="left"/>
       </w:trPr>
       <w:tcPr>
+        <w:tcBorders>
+          <w:bottom w:val="single" w:sz="0" w:space="0" w:color="auto"/>
+        </w:tcBorders>
         <w:vAlign w:val="bottom"/>
-        <w:tcBorders>
-          <w:bottom w:val="single"/>
-        </w:tcBorders>
       </w:tcPr>
     </w:tblStylePr>
   </w:style>
-  <w:style w:customStyle="1" w:styleId="DefinitionTerm" w:type="paragraph">
+  <w:style w:type="paragraph" w:customStyle="1" w:styleId="DefinitionTerm">
     <w:name w:val="Definition Term"/>
     <w:basedOn w:val="Normal"/>
     <w:next w:val="Definition"/>
@@ -752,75 +1024,76 @@
       <w:b/>
     </w:rPr>
   </w:style>
-  <w:style w:customStyle="1" w:styleId="Definition" w:type="paragraph">
+  <w:style w:type="paragraph" w:customStyle="1" w:styleId="Definition">
     <w:name w:val="Definition"/>
     <w:basedOn w:val="Normal"/>
   </w:style>
-  <w:style w:styleId="Caption" w:type="paragraph">
-    <w:name w:val="Caption"/>
-    <w:basedOn w:val="Normal"/>
-    <w:link w:val="BodyTextChar"/>
-    <w:pPr>
-      <w:spacing w:after="120" w:before="0"/>
+  <w:style w:type="paragraph" w:styleId="Caption">
+    <w:name w:val="caption"/>
+    <w:basedOn w:val="Normal"/>
+    <w:link w:val="CaptionChar"/>
+    <w:pPr>
+      <w:spacing w:after="120"/>
     </w:pPr>
     <w:rPr>
       <w:i/>
     </w:rPr>
   </w:style>
-  <w:style w:customStyle="1" w:styleId="TableCaption" w:type="paragraph">
+  <w:style w:type="paragraph" w:customStyle="1" w:styleId="TableCaption">
     <w:name w:val="Table Caption"/>
     <w:basedOn w:val="Caption"/>
     <w:pPr>
       <w:keepNext/>
     </w:pPr>
   </w:style>
-  <w:style w:customStyle="1" w:styleId="ImageCaption" w:type="paragraph">
+  <w:style w:type="paragraph" w:customStyle="1" w:styleId="ImageCaption">
     <w:name w:val="Image Caption"/>
     <w:basedOn w:val="Caption"/>
   </w:style>
-  <w:style w:customStyle="1" w:styleId="Figure" w:type="paragraph">
+  <w:style w:type="paragraph" w:customStyle="1" w:styleId="Figure">
     <w:name w:val="Figure"/>
     <w:basedOn w:val="Normal"/>
   </w:style>
-  <w:style w:customStyle="1" w:styleId="CaptionedFigure" w:type="paragraph">
+  <w:style w:type="paragraph" w:customStyle="1" w:styleId="CaptionedFigure">
     <w:name w:val="Captioned Figure"/>
     <w:basedOn w:val="Figure"/>
     <w:pPr>
       <w:keepNext/>
     </w:pPr>
   </w:style>
-  <w:style w:customStyle="1" w:styleId="BodyTextChar" w:type="character">
-    <w:name w:val="Body Text Char"/>
+  <w:style w:type="character" w:customStyle="1" w:styleId="CaptionChar">
+    <w:name w:val="Caption Char"/>
     <w:basedOn w:val="DefaultParagraphFont"/>
-    <w:link w:val="BodyText"/>
-  </w:style>
-  <w:style w:customStyle="1" w:styleId="VerbatimChar" w:type="character">
+    <w:link w:val="Caption"/>
+  </w:style>
+  <w:style w:type="character" w:customStyle="1" w:styleId="VerbatimChar">
     <w:name w:val="Verbatim Char"/>
-    <w:basedOn w:val="BodyTextChar"/>
-    <w:rPr>
-      <w:rFonts w:ascii="Consolas" w:hAnsi="Consolas"/>
-      <w:sz w:val="22"/>
-    </w:rPr>
-  </w:style>
-  <w:style w:customStyle="1" w:styleId="SectionNumber" w:type="character">
+    <w:basedOn w:val="CaptionChar"/>
+    <w:link w:val="SourceCode"/>
+    <w:rPr>
+      <w:rFonts w:ascii="Consolas" w:hAnsi="Consolas"/>
+      <w:sz w:val="22"/>
+    </w:rPr>
+  </w:style>
+  <w:style w:type="character" w:customStyle="1" w:styleId="SectionNumber">
     <w:name w:val="Section Number"/>
-    <w:basedOn w:val="BodyTextChar"/>
-  </w:style>
-  <w:style w:styleId="FootnoteReference" w:type="character">
-    <w:name w:val="Footnote Reference"/>
-    <w:basedOn w:val="BodyTextChar"/>
+    <w:basedOn w:val="CaptionChar"/>
+  </w:style>
+  <w:style w:type="character" w:styleId="FootnoteReference">
+    <w:name w:val="footnote reference"/>
+    <w:basedOn w:val="CaptionChar"/>
     <w:rPr>
       <w:vertAlign w:val="superscript"/>
     </w:rPr>
   </w:style>
-  <w:style w:styleId="Hyperlink" w:type="character">
+  <w:style w:type="character" w:styleId="Hyperlink">
     <w:name w:val="Hyperlink"/>
-    <w:basedOn w:val="BodyTextChar"/>
-    <w:rPr>
-      <w:color w:themeColor="accent1" w:val="4F81BD"/>
-    </w:rPr>
-  </w:style>
-  <w:style w:styleId="TOCHeading" w:type="paragraph">
+    <w:basedOn w:val="CaptionChar"/>
+    <w:rPr>
+      <w:color w:val="4F81BD" w:themeColor="accent1"/>
+    </w:rPr>
+  </w:style>
+  <w:style w:type="paragraph" w:styleId="TOCHeading">
     <w:name w:val="TOC Heading"/>
     <w:basedOn w:val="Heading1"/>
     <w:next w:val="BodyText"/>
@@ -832,10 +1105,9 @@
       <w:outlineLvl w:val="9"/>
     </w:pPr>
     <w:rPr>
-      <w:rFonts w:asciiTheme="majorHAnsi" w:cstheme="majorBidi" w:eastAsiaTheme="majorEastAsia" w:hAnsiTheme="majorHAnsi"/>
       <w:b w:val="0"/>
       <w:bCs w:val="0"/>
-      <w:color w:themeColor="accent1" w:themeShade="BF" w:val="365F91"/>
+      <w:color w:val="365F91" w:themeColor="accent1" w:themeShade="BF"/>
     </w:rPr>
   </w:style>
   <w:style w:type="paragraph" w:customStyle="1" w:styleId="SourceCode">
@@ -843,234 +1115,299 @@
     <w:basedOn w:val="Normal"/>
     <w:link w:val="VerbatimChar"/>
     <w:pPr>
-      <w:wordWrap w:val="off"/>
+      <w:wordWrap w:val="0"/>
     </w:pPr>
   </w:style>
   <w:style w:type="character" w:customStyle="1" w:styleId="KeywordTok">
     <w:name w:val="KeywordTok"/>
     <w:basedOn w:val="VerbatimChar"/>
     <w:rPr>
+      <w:rFonts w:ascii="Consolas" w:hAnsi="Consolas"/>
+      <w:b/>
       <w:color w:val="007020"/>
-      <w:b/>
+      <w:sz w:val="22"/>
     </w:rPr>
   </w:style>
   <w:style w:type="character" w:customStyle="1" w:styleId="DataTypeTok">
     <w:name w:val="DataTypeTok"/>
     <w:basedOn w:val="VerbatimChar"/>
     <w:rPr>
+      <w:rFonts w:ascii="Consolas" w:hAnsi="Consolas"/>
       <w:color w:val="902000"/>
+      <w:sz w:val="22"/>
     </w:rPr>
   </w:style>
   <w:style w:type="character" w:customStyle="1" w:styleId="DecValTok">
     <w:name w:val="DecValTok"/>
     <w:basedOn w:val="VerbatimChar"/>
     <w:rPr>
-      <w:color w:val="40a070"/>
+      <w:rFonts w:ascii="Consolas" w:hAnsi="Consolas"/>
+      <w:color w:val="40A070"/>
+      <w:sz w:val="22"/>
     </w:rPr>
   </w:style>
   <w:style w:type="character" w:customStyle="1" w:styleId="BaseNTok">
     <w:name w:val="BaseNTok"/>
     <w:basedOn w:val="VerbatimChar"/>
     <w:rPr>
-      <w:color w:val="40a070"/>
+      <w:rFonts w:ascii="Consolas" w:hAnsi="Consolas"/>
+      <w:color w:val="40A070"/>
+      <w:sz w:val="22"/>
     </w:rPr>
   </w:style>
   <w:style w:type="character" w:customStyle="1" w:styleId="FloatTok">
     <w:name w:val="FloatTok"/>
     <w:basedOn w:val="VerbatimChar"/>
     <w:rPr>
-      <w:color w:val="40a070"/>
+      <w:rFonts w:ascii="Consolas" w:hAnsi="Consolas"/>
+      <w:color w:val="40A070"/>
+      <w:sz w:val="22"/>
     </w:rPr>
   </w:style>
   <w:style w:type="character" w:customStyle="1" w:styleId="ConstantTok">
     <w:name w:val="ConstantTok"/>
     <w:basedOn w:val="VerbatimChar"/>
     <w:rPr>
+      <w:rFonts w:ascii="Consolas" w:hAnsi="Consolas"/>
       <w:color w:val="880000"/>
+      <w:sz w:val="22"/>
     </w:rPr>
   </w:style>
   <w:style w:type="character" w:customStyle="1" w:styleId="CharTok">
     <w:name w:val="CharTok"/>
     <w:basedOn w:val="VerbatimChar"/>
     <w:rPr>
-      <w:color w:val="4070a0"/>
+      <w:rFonts w:ascii="Consolas" w:hAnsi="Consolas"/>
+      <w:color w:val="4070A0"/>
+      <w:sz w:val="22"/>
     </w:rPr>
   </w:style>
   <w:style w:type="character" w:customStyle="1" w:styleId="SpecialCharTok">
     <w:name w:val="SpecialCharTok"/>
     <w:basedOn w:val="VerbatimChar"/>
     <w:rPr>
-      <w:color w:val="4070a0"/>
+      <w:rFonts w:ascii="Consolas" w:hAnsi="Consolas"/>
+      <w:color w:val="4070A0"/>
+      <w:sz w:val="22"/>
     </w:rPr>
   </w:style>
   <w:style w:type="character" w:customStyle="1" w:styleId="StringTok">
     <w:name w:val="StringTok"/>
     <w:basedOn w:val="VerbatimChar"/>
     <w:rPr>
-      <w:color w:val="4070a0"/>
+      <w:rFonts w:ascii="Consolas" w:hAnsi="Consolas"/>
+      <w:color w:val="4070A0"/>
+      <w:sz w:val="22"/>
     </w:rPr>
   </w:style>
   <w:style w:type="character" w:customStyle="1" w:styleId="VerbatimStringTok">
     <w:name w:val="VerbatimStringTok"/>
     <w:basedOn w:val="VerbatimChar"/>
     <w:rPr>
-      <w:color w:val="4070a0"/>
+      <w:rFonts w:ascii="Consolas" w:hAnsi="Consolas"/>
+      <w:color w:val="4070A0"/>
+      <w:sz w:val="22"/>
     </w:rPr>
   </w:style>
   <w:style w:type="character" w:customStyle="1" w:styleId="SpecialStringTok">
     <w:name w:val="SpecialStringTok"/>
     <w:basedOn w:val="VerbatimChar"/>
     <w:rPr>
-      <w:color w:val="bb6688"/>
+      <w:rFonts w:ascii="Consolas" w:hAnsi="Consolas"/>
+      <w:color w:val="BB6688"/>
+      <w:sz w:val="22"/>
     </w:rPr>
   </w:style>
   <w:style w:type="character" w:customStyle="1" w:styleId="ImportTok">
     <w:name w:val="ImportTok"/>
     <w:basedOn w:val="VerbatimChar"/>
     <w:rPr>
+      <w:rFonts w:ascii="Consolas" w:hAnsi="Consolas"/>
+      <w:b/>
       <w:color w:val="008000"/>
-      <w:b/>
+      <w:sz w:val="22"/>
     </w:rPr>
   </w:style>
   <w:style w:type="character" w:customStyle="1" w:styleId="CommentTok">
     <w:name w:val="CommentTok"/>
     <w:basedOn w:val="VerbatimChar"/>
     <w:rPr>
-      <w:color w:val="60a0b0"/>
+      <w:rFonts w:ascii="Consolas" w:hAnsi="Consolas"/>
       <w:i/>
+      <w:color w:val="60A0B0"/>
+      <w:sz w:val="22"/>
     </w:rPr>
   </w:style>
   <w:style w:type="character" w:customStyle="1" w:styleId="DocumentationTok">
     <w:name w:val="DocumentationTok"/>
     <w:basedOn w:val="VerbatimChar"/>
     <w:rPr>
-      <w:color w:val="ba2121"/>
+      <w:rFonts w:ascii="Consolas" w:hAnsi="Consolas"/>
       <w:i/>
+      <w:color w:val="BA2121"/>
+      <w:sz w:val="22"/>
     </w:rPr>
   </w:style>
   <w:style w:type="character" w:customStyle="1" w:styleId="AnnotationTok">
     <w:name w:val="AnnotationTok"/>
     <w:basedOn w:val="VerbatimChar"/>
     <w:rPr>
-      <w:color w:val="60a0b0"/>
+      <w:rFonts w:ascii="Consolas" w:hAnsi="Consolas"/>
       <w:b/>
       <w:i/>
+      <w:color w:val="60A0B0"/>
+      <w:sz w:val="22"/>
     </w:rPr>
   </w:style>
   <w:style w:type="character" w:customStyle="1" w:styleId="CommentVarTok">
     <w:name w:val="CommentVarTok"/>
     <w:basedOn w:val="VerbatimChar"/>
     <w:rPr>
-      <w:color w:val="60a0b0"/>
+      <w:rFonts w:ascii="Consolas" w:hAnsi="Consolas"/>
       <w:b/>
       <w:i/>
+      <w:color w:val="60A0B0"/>
+      <w:sz w:val="22"/>
     </w:rPr>
   </w:style>
   <w:style w:type="character" w:customStyle="1" w:styleId="OtherTok">
     <w:name w:val="OtherTok"/>
     <w:basedOn w:val="VerbatimChar"/>
     <w:rPr>
+      <w:rFonts w:ascii="Consolas" w:hAnsi="Consolas"/>
       <w:color w:val="007020"/>
+      <w:sz w:val="22"/>
     </w:rPr>
   </w:style>
   <w:style w:type="character" w:customStyle="1" w:styleId="FunctionTok">
     <w:name w:val="FunctionTok"/>
     <w:basedOn w:val="VerbatimChar"/>
     <w:rPr>
-      <w:color w:val="06287e"/>
+      <w:rFonts w:ascii="Consolas" w:hAnsi="Consolas"/>
+      <w:color w:val="06287E"/>
+      <w:sz w:val="22"/>
     </w:rPr>
   </w:style>
   <w:style w:type="character" w:customStyle="1" w:styleId="VariableTok">
     <w:name w:val="VariableTok"/>
     <w:basedOn w:val="VerbatimChar"/>
     <w:rPr>
-      <w:color w:val="19177c"/>
+      <w:rFonts w:ascii="Consolas" w:hAnsi="Consolas"/>
+      <w:color w:val="19177C"/>
+      <w:sz w:val="22"/>
     </w:rPr>
   </w:style>
   <w:style w:type="character" w:customStyle="1" w:styleId="ControlFlowTok">
     <w:name w:val="ControlFlowTok"/>
     <w:basedOn w:val="VerbatimChar"/>
     <w:rPr>
+      <w:rFonts w:ascii="Consolas" w:hAnsi="Consolas"/>
+      <w:b/>
       <w:color w:val="007020"/>
-      <w:b/>
+      <w:sz w:val="22"/>
     </w:rPr>
   </w:style>
   <w:style w:type="character" w:customStyle="1" w:styleId="OperatorTok">
     <w:name w:val="OperatorTok"/>
     <w:basedOn w:val="VerbatimChar"/>
     <w:rPr>
+      <w:rFonts w:ascii="Consolas" w:hAnsi="Consolas"/>
       <w:color w:val="666666"/>
+      <w:sz w:val="22"/>
     </w:rPr>
   </w:style>
   <w:style w:type="character" w:customStyle="1" w:styleId="BuiltInTok">
     <w:name w:val="BuiltInTok"/>
     <w:basedOn w:val="VerbatimChar"/>
     <w:rPr>
+      <w:rFonts w:ascii="Consolas" w:hAnsi="Consolas"/>
       <w:color w:val="008000"/>
+      <w:sz w:val="22"/>
     </w:rPr>
   </w:style>
   <w:style w:type="character" w:customStyle="1" w:styleId="ExtensionTok">
     <w:name w:val="ExtensionTok"/>
     <w:basedOn w:val="VerbatimChar"/>
-    <w:rPr/>
+    <w:rPr>
+      <w:rFonts w:ascii="Consolas" w:hAnsi="Consolas"/>
+      <w:sz w:val="22"/>
+    </w:rPr>
   </w:style>
   <w:style w:type="character" w:customStyle="1" w:styleId="PreprocessorTok">
     <w:name w:val="PreprocessorTok"/>
     <w:basedOn w:val="VerbatimChar"/>
     <w:rPr>
-      <w:color w:val="bc7a00"/>
+      <w:rFonts w:ascii="Consolas" w:hAnsi="Consolas"/>
+      <w:color w:val="BC7A00"/>
+      <w:sz w:val="22"/>
     </w:rPr>
   </w:style>
   <w:style w:type="character" w:customStyle="1" w:styleId="AttributeTok">
     <w:name w:val="AttributeTok"/>
     <w:basedOn w:val="VerbatimChar"/>
     <w:rPr>
-      <w:color w:val="7d9029"/>
+      <w:rFonts w:ascii="Consolas" w:hAnsi="Consolas"/>
+      <w:color w:val="7D9029"/>
+      <w:sz w:val="22"/>
     </w:rPr>
   </w:style>
   <w:style w:type="character" w:customStyle="1" w:styleId="RegionMarkerTok">
     <w:name w:val="RegionMarkerTok"/>
     <w:basedOn w:val="VerbatimChar"/>
-    <w:rPr/>
+    <w:rPr>
+      <w:rFonts w:ascii="Consolas" w:hAnsi="Consolas"/>
+      <w:sz w:val="22"/>
+    </w:rPr>
   </w:style>
   <w:style w:type="character" w:customStyle="1" w:styleId="InformationTok">
     <w:name w:val="InformationTok"/>
     <w:basedOn w:val="VerbatimChar"/>
     <w:rPr>
-      <w:color w:val="60a0b0"/>
+      <w:rFonts w:ascii="Consolas" w:hAnsi="Consolas"/>
       <w:b/>
       <w:i/>
+      <w:color w:val="60A0B0"/>
+      <w:sz w:val="22"/>
     </w:rPr>
   </w:style>
   <w:style w:type="character" w:customStyle="1" w:styleId="WarningTok">
     <w:name w:val="WarningTok"/>
     <w:basedOn w:val="VerbatimChar"/>
     <w:rPr>
-      <w:color w:val="60a0b0"/>
+      <w:rFonts w:ascii="Consolas" w:hAnsi="Consolas"/>
       <w:b/>
       <w:i/>
+      <w:color w:val="60A0B0"/>
+      <w:sz w:val="22"/>
     </w:rPr>
   </w:style>
   <w:style w:type="character" w:customStyle="1" w:styleId="AlertTok">
     <w:name w:val="AlertTok"/>
     <w:basedOn w:val="VerbatimChar"/>
     <w:rPr>
-      <w:color w:val="ff0000"/>
+      <w:rFonts w:ascii="Consolas" w:hAnsi="Consolas"/>
       <w:b/>
+      <w:color w:val="FF0000"/>
+      <w:sz w:val="22"/>
     </w:rPr>
   </w:style>
   <w:style w:type="character" w:customStyle="1" w:styleId="ErrorTok">
     <w:name w:val="ErrorTok"/>
     <w:basedOn w:val="VerbatimChar"/>
     <w:rPr>
-      <w:color w:val="ff0000"/>
+      <w:rFonts w:ascii="Consolas" w:hAnsi="Consolas"/>
       <w:b/>
+      <w:color w:val="FF0000"/>
+      <w:sz w:val="22"/>
     </w:rPr>
   </w:style>
   <w:style w:type="character" w:customStyle="1" w:styleId="NormalTok">
     <w:name w:val="NormalTok"/>
     <w:basedOn w:val="VerbatimChar"/>
-    <w:rPr/>
+    <w:rPr>
+      <w:rFonts w:ascii="Consolas" w:hAnsi="Consolas"/>
+      <w:sz w:val="22"/>
+    </w:rPr>
   </w:style>
 </w:styles>
 </file>

</xml_diff>